<commit_message>
Added Analyis section, made a start on design, changed contents table
</commit_message>
<xml_diff>
--- a/to-do-app/Project-Document.docx
+++ b/to-do-app/Project-Document.docx
@@ -20,60 +20,1477 @@
         <w:t>Project Document</w:t>
       </w:r>
     </w:p>
+    <w:p/>
+    <w:sdt>
+      <w:sdtPr>
+        <w:rPr>
+          <w:rFonts w:asciiTheme="minorHAnsi" w:eastAsiaTheme="minorHAnsi" w:hAnsiTheme="minorHAnsi" w:cstheme="minorBidi"/>
+          <w:color w:val="auto"/>
+          <w:kern w:val="2"/>
+          <w:sz w:val="24"/>
+          <w:szCs w:val="24"/>
+          <w:lang w:val="en-GB"/>
+          <w14:ligatures w14:val="standardContextual"/>
+        </w:rPr>
+        <w:id w:val="-2036494492"/>
+        <w:docPartObj>
+          <w:docPartGallery w:val="Table of Contents"/>
+          <w:docPartUnique/>
+        </w:docPartObj>
+      </w:sdtPr>
+      <w:sdtEndPr>
+        <w:rPr>
+          <w:b/>
+          <w:bCs/>
+          <w:noProof/>
+        </w:rPr>
+      </w:sdtEndPr>
+      <w:sdtContent>
+        <w:p>
+          <w:pPr>
+            <w:pStyle w:val="TOCHeading"/>
+          </w:pPr>
+          <w:r>
+            <w:t>Contents</w:t>
+          </w:r>
+        </w:p>
+        <w:p>
+          <w:pPr>
+            <w:pStyle w:val="TOC1"/>
+            <w:tabs>
+              <w:tab w:val="right" w:leader="dot" w:pos="9016"/>
+            </w:tabs>
+            <w:rPr>
+              <w:rFonts w:eastAsiaTheme="minorEastAsia"/>
+              <w:noProof/>
+              <w:lang w:eastAsia="en-GB"/>
+            </w:rPr>
+          </w:pPr>
+          <w:r>
+            <w:fldChar w:fldCharType="begin"/>
+          </w:r>
+          <w:r>
+            <w:instrText xml:space="preserve"> TOC \o "1-3" \h \z \u </w:instrText>
+          </w:r>
+          <w:r>
+            <w:fldChar w:fldCharType="separate"/>
+          </w:r>
+          <w:hyperlink w:anchor="_Toc208332742" w:history="1">
+            <w:r>
+              <w:rPr>
+                <w:rStyle w:val="Hyperlink"/>
+                <w:noProof/>
+              </w:rPr>
+              <w:t>Purpose</w:t>
+            </w:r>
+            <w:r>
+              <w:rPr>
+                <w:noProof/>
+                <w:webHidden/>
+              </w:rPr>
+              <w:tab/>
+            </w:r>
+            <w:r>
+              <w:rPr>
+                <w:noProof/>
+                <w:webHidden/>
+              </w:rPr>
+              <w:fldChar w:fldCharType="begin"/>
+            </w:r>
+            <w:r>
+              <w:rPr>
+                <w:noProof/>
+                <w:webHidden/>
+              </w:rPr>
+              <w:instrText xml:space="preserve"> PAGEREF _Toc208332742 \h </w:instrText>
+            </w:r>
+            <w:r>
+              <w:rPr>
+                <w:noProof/>
+                <w:webHidden/>
+              </w:rPr>
+            </w:r>
+            <w:r>
+              <w:rPr>
+                <w:noProof/>
+                <w:webHidden/>
+              </w:rPr>
+              <w:fldChar w:fldCharType="separate"/>
+            </w:r>
+            <w:r>
+              <w:rPr>
+                <w:noProof/>
+                <w:webHidden/>
+              </w:rPr>
+              <w:t>1</w:t>
+            </w:r>
+            <w:r>
+              <w:rPr>
+                <w:noProof/>
+                <w:webHidden/>
+              </w:rPr>
+              <w:fldChar w:fldCharType="end"/>
+            </w:r>
+          </w:hyperlink>
+        </w:p>
+        <w:p>
+          <w:pPr>
+            <w:pStyle w:val="TOC2"/>
+            <w:tabs>
+              <w:tab w:val="right" w:leader="dot" w:pos="9016"/>
+            </w:tabs>
+            <w:rPr>
+              <w:rFonts w:eastAsiaTheme="minorEastAsia"/>
+              <w:noProof/>
+              <w:lang w:eastAsia="en-GB"/>
+            </w:rPr>
+          </w:pPr>
+          <w:hyperlink w:anchor="_Toc208332743" w:history="1">
+            <w:r>
+              <w:rPr>
+                <w:rStyle w:val="Hyperlink"/>
+                <w:noProof/>
+              </w:rPr>
+              <w:t>Introduction</w:t>
+            </w:r>
+            <w:r>
+              <w:rPr>
+                <w:noProof/>
+                <w:webHidden/>
+              </w:rPr>
+              <w:tab/>
+            </w:r>
+            <w:r>
+              <w:rPr>
+                <w:noProof/>
+                <w:webHidden/>
+              </w:rPr>
+              <w:fldChar w:fldCharType="begin"/>
+            </w:r>
+            <w:r>
+              <w:rPr>
+                <w:noProof/>
+                <w:webHidden/>
+              </w:rPr>
+              <w:instrText xml:space="preserve"> PAGEREF _Toc208332743 \h </w:instrText>
+            </w:r>
+            <w:r>
+              <w:rPr>
+                <w:noProof/>
+                <w:webHidden/>
+              </w:rPr>
+            </w:r>
+            <w:r>
+              <w:rPr>
+                <w:noProof/>
+                <w:webHidden/>
+              </w:rPr>
+              <w:fldChar w:fldCharType="separate"/>
+            </w:r>
+            <w:r>
+              <w:rPr>
+                <w:noProof/>
+                <w:webHidden/>
+              </w:rPr>
+              <w:t>1</w:t>
+            </w:r>
+            <w:r>
+              <w:rPr>
+                <w:noProof/>
+                <w:webHidden/>
+              </w:rPr>
+              <w:fldChar w:fldCharType="end"/>
+            </w:r>
+          </w:hyperlink>
+        </w:p>
+        <w:p>
+          <w:pPr>
+            <w:pStyle w:val="TOC2"/>
+            <w:tabs>
+              <w:tab w:val="right" w:leader="dot" w:pos="9016"/>
+            </w:tabs>
+            <w:rPr>
+              <w:rFonts w:eastAsiaTheme="minorEastAsia"/>
+              <w:noProof/>
+              <w:lang w:eastAsia="en-GB"/>
+            </w:rPr>
+          </w:pPr>
+          <w:hyperlink w:anchor="_Toc208332744" w:history="1">
+            <w:r>
+              <w:rPr>
+                <w:rStyle w:val="Hyperlink"/>
+                <w:noProof/>
+              </w:rPr>
+              <w:t>The Problem</w:t>
+            </w:r>
+            <w:r>
+              <w:rPr>
+                <w:noProof/>
+                <w:webHidden/>
+              </w:rPr>
+              <w:tab/>
+            </w:r>
+            <w:r>
+              <w:rPr>
+                <w:noProof/>
+                <w:webHidden/>
+              </w:rPr>
+              <w:fldChar w:fldCharType="begin"/>
+            </w:r>
+            <w:r>
+              <w:rPr>
+                <w:noProof/>
+                <w:webHidden/>
+              </w:rPr>
+              <w:instrText xml:space="preserve"> PAGEREF _Toc208332744 \h </w:instrText>
+            </w:r>
+            <w:r>
+              <w:rPr>
+                <w:noProof/>
+                <w:webHidden/>
+              </w:rPr>
+            </w:r>
+            <w:r>
+              <w:rPr>
+                <w:noProof/>
+                <w:webHidden/>
+              </w:rPr>
+              <w:fldChar w:fldCharType="separate"/>
+            </w:r>
+            <w:r>
+              <w:rPr>
+                <w:noProof/>
+                <w:webHidden/>
+              </w:rPr>
+              <w:t>2</w:t>
+            </w:r>
+            <w:r>
+              <w:rPr>
+                <w:noProof/>
+                <w:webHidden/>
+              </w:rPr>
+              <w:fldChar w:fldCharType="end"/>
+            </w:r>
+          </w:hyperlink>
+        </w:p>
+        <w:p>
+          <w:pPr>
+            <w:pStyle w:val="TOC1"/>
+            <w:tabs>
+              <w:tab w:val="right" w:leader="dot" w:pos="9016"/>
+            </w:tabs>
+            <w:rPr>
+              <w:rFonts w:eastAsiaTheme="minorEastAsia"/>
+              <w:noProof/>
+              <w:lang w:eastAsia="en-GB"/>
+            </w:rPr>
+          </w:pPr>
+          <w:hyperlink w:anchor="_Toc208332745" w:history="1">
+            <w:r>
+              <w:rPr>
+                <w:rStyle w:val="Hyperlink"/>
+                <w:noProof/>
+              </w:rPr>
+              <w:t>Analysis</w:t>
+            </w:r>
+            <w:r>
+              <w:rPr>
+                <w:noProof/>
+                <w:webHidden/>
+              </w:rPr>
+              <w:tab/>
+            </w:r>
+            <w:r>
+              <w:rPr>
+                <w:noProof/>
+                <w:webHidden/>
+              </w:rPr>
+              <w:fldChar w:fldCharType="begin"/>
+            </w:r>
+            <w:r>
+              <w:rPr>
+                <w:noProof/>
+                <w:webHidden/>
+              </w:rPr>
+              <w:instrText xml:space="preserve"> PAGEREF _Toc208332745 \h </w:instrText>
+            </w:r>
+            <w:r>
+              <w:rPr>
+                <w:noProof/>
+                <w:webHidden/>
+              </w:rPr>
+            </w:r>
+            <w:r>
+              <w:rPr>
+                <w:noProof/>
+                <w:webHidden/>
+              </w:rPr>
+              <w:fldChar w:fldCharType="separate"/>
+            </w:r>
+            <w:r>
+              <w:rPr>
+                <w:noProof/>
+                <w:webHidden/>
+              </w:rPr>
+              <w:t>2</w:t>
+            </w:r>
+            <w:r>
+              <w:rPr>
+                <w:noProof/>
+                <w:webHidden/>
+              </w:rPr>
+              <w:fldChar w:fldCharType="end"/>
+            </w:r>
+          </w:hyperlink>
+        </w:p>
+        <w:p>
+          <w:pPr>
+            <w:pStyle w:val="TOC2"/>
+            <w:tabs>
+              <w:tab w:val="right" w:leader="dot" w:pos="9016"/>
+            </w:tabs>
+            <w:rPr>
+              <w:rFonts w:eastAsiaTheme="minorEastAsia"/>
+              <w:noProof/>
+              <w:lang w:eastAsia="en-GB"/>
+            </w:rPr>
+          </w:pPr>
+          <w:hyperlink w:anchor="_Toc208332746" w:history="1">
+            <w:r>
+              <w:rPr>
+                <w:rStyle w:val="Hyperlink"/>
+                <w:noProof/>
+              </w:rPr>
+              <w:t>Target Users</w:t>
+            </w:r>
+            <w:r>
+              <w:rPr>
+                <w:noProof/>
+                <w:webHidden/>
+              </w:rPr>
+              <w:tab/>
+            </w:r>
+            <w:r>
+              <w:rPr>
+                <w:noProof/>
+                <w:webHidden/>
+              </w:rPr>
+              <w:fldChar w:fldCharType="begin"/>
+            </w:r>
+            <w:r>
+              <w:rPr>
+                <w:noProof/>
+                <w:webHidden/>
+              </w:rPr>
+              <w:instrText xml:space="preserve"> PAGEREF _Toc208332746 \h </w:instrText>
+            </w:r>
+            <w:r>
+              <w:rPr>
+                <w:noProof/>
+                <w:webHidden/>
+              </w:rPr>
+            </w:r>
+            <w:r>
+              <w:rPr>
+                <w:noProof/>
+                <w:webHidden/>
+              </w:rPr>
+              <w:fldChar w:fldCharType="separate"/>
+            </w:r>
+            <w:r>
+              <w:rPr>
+                <w:noProof/>
+                <w:webHidden/>
+              </w:rPr>
+              <w:t>2</w:t>
+            </w:r>
+            <w:r>
+              <w:rPr>
+                <w:noProof/>
+                <w:webHidden/>
+              </w:rPr>
+              <w:fldChar w:fldCharType="end"/>
+            </w:r>
+          </w:hyperlink>
+        </w:p>
+        <w:p>
+          <w:pPr>
+            <w:pStyle w:val="TOC2"/>
+            <w:tabs>
+              <w:tab w:val="right" w:leader="dot" w:pos="9016"/>
+            </w:tabs>
+            <w:rPr>
+              <w:rFonts w:eastAsiaTheme="minorEastAsia"/>
+              <w:noProof/>
+              <w:lang w:eastAsia="en-GB"/>
+            </w:rPr>
+          </w:pPr>
+          <w:hyperlink w:anchor="_Toc208332747" w:history="1">
+            <w:r>
+              <w:rPr>
+                <w:rStyle w:val="Hyperlink"/>
+                <w:noProof/>
+              </w:rPr>
+              <w:t>Other implementations</w:t>
+            </w:r>
+            <w:r>
+              <w:rPr>
+                <w:noProof/>
+                <w:webHidden/>
+              </w:rPr>
+              <w:tab/>
+            </w:r>
+            <w:r>
+              <w:rPr>
+                <w:noProof/>
+                <w:webHidden/>
+              </w:rPr>
+              <w:fldChar w:fldCharType="begin"/>
+            </w:r>
+            <w:r>
+              <w:rPr>
+                <w:noProof/>
+                <w:webHidden/>
+              </w:rPr>
+              <w:instrText xml:space="preserve"> PAGEREF _Toc208332747 \h </w:instrText>
+            </w:r>
+            <w:r>
+              <w:rPr>
+                <w:noProof/>
+                <w:webHidden/>
+              </w:rPr>
+            </w:r>
+            <w:r>
+              <w:rPr>
+                <w:noProof/>
+                <w:webHidden/>
+              </w:rPr>
+              <w:fldChar w:fldCharType="separate"/>
+            </w:r>
+            <w:r>
+              <w:rPr>
+                <w:noProof/>
+                <w:webHidden/>
+              </w:rPr>
+              <w:t>3</w:t>
+            </w:r>
+            <w:r>
+              <w:rPr>
+                <w:noProof/>
+                <w:webHidden/>
+              </w:rPr>
+              <w:fldChar w:fldCharType="end"/>
+            </w:r>
+          </w:hyperlink>
+        </w:p>
+        <w:p>
+          <w:pPr>
+            <w:pStyle w:val="TOC3"/>
+            <w:tabs>
+              <w:tab w:val="right" w:leader="dot" w:pos="9016"/>
+            </w:tabs>
+            <w:rPr>
+              <w:rFonts w:eastAsiaTheme="minorEastAsia"/>
+              <w:noProof/>
+              <w:lang w:eastAsia="en-GB"/>
+            </w:rPr>
+          </w:pPr>
+          <w:hyperlink w:anchor="_Toc208332748" w:history="1">
+            <w:r>
+              <w:rPr>
+                <w:rStyle w:val="Hyperlink"/>
+                <w:noProof/>
+              </w:rPr>
+              <w:t>Example One – ‘Todoist’</w:t>
+            </w:r>
+            <w:r>
+              <w:rPr>
+                <w:noProof/>
+                <w:webHidden/>
+              </w:rPr>
+              <w:tab/>
+            </w:r>
+            <w:r>
+              <w:rPr>
+                <w:noProof/>
+                <w:webHidden/>
+              </w:rPr>
+              <w:fldChar w:fldCharType="begin"/>
+            </w:r>
+            <w:r>
+              <w:rPr>
+                <w:noProof/>
+                <w:webHidden/>
+              </w:rPr>
+              <w:instrText xml:space="preserve"> PAGEREF _Toc208332748 \h </w:instrText>
+            </w:r>
+            <w:r>
+              <w:rPr>
+                <w:noProof/>
+                <w:webHidden/>
+              </w:rPr>
+            </w:r>
+            <w:r>
+              <w:rPr>
+                <w:noProof/>
+                <w:webHidden/>
+              </w:rPr>
+              <w:fldChar w:fldCharType="separate"/>
+            </w:r>
+            <w:r>
+              <w:rPr>
+                <w:noProof/>
+                <w:webHidden/>
+              </w:rPr>
+              <w:t>3</w:t>
+            </w:r>
+            <w:r>
+              <w:rPr>
+                <w:noProof/>
+                <w:webHidden/>
+              </w:rPr>
+              <w:fldChar w:fldCharType="end"/>
+            </w:r>
+          </w:hyperlink>
+        </w:p>
+        <w:p>
+          <w:pPr>
+            <w:pStyle w:val="TOC3"/>
+            <w:tabs>
+              <w:tab w:val="right" w:leader="dot" w:pos="9016"/>
+            </w:tabs>
+            <w:rPr>
+              <w:rFonts w:eastAsiaTheme="minorEastAsia"/>
+              <w:noProof/>
+              <w:lang w:eastAsia="en-GB"/>
+            </w:rPr>
+          </w:pPr>
+          <w:hyperlink w:anchor="_Toc208332749" w:history="1">
+            <w:r>
+              <w:rPr>
+                <w:rStyle w:val="Hyperlink"/>
+                <w:noProof/>
+              </w:rPr>
+              <w:t>Example Two – ‘Microsoft To Do’</w:t>
+            </w:r>
+            <w:r>
+              <w:rPr>
+                <w:noProof/>
+                <w:webHidden/>
+              </w:rPr>
+              <w:tab/>
+            </w:r>
+            <w:r>
+              <w:rPr>
+                <w:noProof/>
+                <w:webHidden/>
+              </w:rPr>
+              <w:fldChar w:fldCharType="begin"/>
+            </w:r>
+            <w:r>
+              <w:rPr>
+                <w:noProof/>
+                <w:webHidden/>
+              </w:rPr>
+              <w:instrText xml:space="preserve"> PAGEREF _Toc208332749 \h </w:instrText>
+            </w:r>
+            <w:r>
+              <w:rPr>
+                <w:noProof/>
+                <w:webHidden/>
+              </w:rPr>
+            </w:r>
+            <w:r>
+              <w:rPr>
+                <w:noProof/>
+                <w:webHidden/>
+              </w:rPr>
+              <w:fldChar w:fldCharType="separate"/>
+            </w:r>
+            <w:r>
+              <w:rPr>
+                <w:noProof/>
+                <w:webHidden/>
+              </w:rPr>
+              <w:t>4</w:t>
+            </w:r>
+            <w:r>
+              <w:rPr>
+                <w:noProof/>
+                <w:webHidden/>
+              </w:rPr>
+              <w:fldChar w:fldCharType="end"/>
+            </w:r>
+          </w:hyperlink>
+        </w:p>
+        <w:p>
+          <w:pPr>
+            <w:pStyle w:val="TOC2"/>
+            <w:tabs>
+              <w:tab w:val="right" w:leader="dot" w:pos="9016"/>
+            </w:tabs>
+            <w:rPr>
+              <w:rFonts w:eastAsiaTheme="minorEastAsia"/>
+              <w:noProof/>
+              <w:lang w:eastAsia="en-GB"/>
+            </w:rPr>
+          </w:pPr>
+          <w:hyperlink w:anchor="_Toc208332750" w:history="1">
+            <w:r>
+              <w:rPr>
+                <w:rStyle w:val="Hyperlink"/>
+                <w:noProof/>
+              </w:rPr>
+              <w:t>Feature Requirements</w:t>
+            </w:r>
+            <w:r>
+              <w:rPr>
+                <w:noProof/>
+                <w:webHidden/>
+              </w:rPr>
+              <w:tab/>
+            </w:r>
+            <w:r>
+              <w:rPr>
+                <w:noProof/>
+                <w:webHidden/>
+              </w:rPr>
+              <w:fldChar w:fldCharType="begin"/>
+            </w:r>
+            <w:r>
+              <w:rPr>
+                <w:noProof/>
+                <w:webHidden/>
+              </w:rPr>
+              <w:instrText xml:space="preserve"> PAGEREF _Toc208332750 \h </w:instrText>
+            </w:r>
+            <w:r>
+              <w:rPr>
+                <w:noProof/>
+                <w:webHidden/>
+              </w:rPr>
+            </w:r>
+            <w:r>
+              <w:rPr>
+                <w:noProof/>
+                <w:webHidden/>
+              </w:rPr>
+              <w:fldChar w:fldCharType="separate"/>
+            </w:r>
+            <w:r>
+              <w:rPr>
+                <w:noProof/>
+                <w:webHidden/>
+              </w:rPr>
+              <w:t>4</w:t>
+            </w:r>
+            <w:r>
+              <w:rPr>
+                <w:noProof/>
+                <w:webHidden/>
+              </w:rPr>
+              <w:fldChar w:fldCharType="end"/>
+            </w:r>
+          </w:hyperlink>
+        </w:p>
+        <w:p>
+          <w:pPr>
+            <w:pStyle w:val="TOC2"/>
+            <w:tabs>
+              <w:tab w:val="right" w:leader="dot" w:pos="9016"/>
+            </w:tabs>
+            <w:rPr>
+              <w:rFonts w:eastAsiaTheme="minorEastAsia"/>
+              <w:noProof/>
+              <w:lang w:eastAsia="en-GB"/>
+            </w:rPr>
+          </w:pPr>
+          <w:hyperlink w:anchor="_Toc208332751" w:history="1">
+            <w:r>
+              <w:rPr>
+                <w:rStyle w:val="Hyperlink"/>
+                <w:noProof/>
+              </w:rPr>
+              <w:t>Technical Research</w:t>
+            </w:r>
+            <w:r>
+              <w:rPr>
+                <w:noProof/>
+                <w:webHidden/>
+              </w:rPr>
+              <w:tab/>
+            </w:r>
+            <w:r>
+              <w:rPr>
+                <w:noProof/>
+                <w:webHidden/>
+              </w:rPr>
+              <w:fldChar w:fldCharType="begin"/>
+            </w:r>
+            <w:r>
+              <w:rPr>
+                <w:noProof/>
+                <w:webHidden/>
+              </w:rPr>
+              <w:instrText xml:space="preserve"> PAGEREF _Toc208332751 \h </w:instrText>
+            </w:r>
+            <w:r>
+              <w:rPr>
+                <w:noProof/>
+                <w:webHidden/>
+              </w:rPr>
+            </w:r>
+            <w:r>
+              <w:rPr>
+                <w:noProof/>
+                <w:webHidden/>
+              </w:rPr>
+              <w:fldChar w:fldCharType="separate"/>
+            </w:r>
+            <w:r>
+              <w:rPr>
+                <w:noProof/>
+                <w:webHidden/>
+              </w:rPr>
+              <w:t>5</w:t>
+            </w:r>
+            <w:r>
+              <w:rPr>
+                <w:noProof/>
+                <w:webHidden/>
+              </w:rPr>
+              <w:fldChar w:fldCharType="end"/>
+            </w:r>
+          </w:hyperlink>
+        </w:p>
+        <w:p>
+          <w:pPr>
+            <w:pStyle w:val="TOC3"/>
+            <w:tabs>
+              <w:tab w:val="right" w:leader="dot" w:pos="9016"/>
+            </w:tabs>
+            <w:rPr>
+              <w:rFonts w:eastAsiaTheme="minorEastAsia"/>
+              <w:noProof/>
+              <w:lang w:eastAsia="en-GB"/>
+            </w:rPr>
+          </w:pPr>
+          <w:hyperlink w:anchor="_Toc208332752" w:history="1">
+            <w:r>
+              <w:rPr>
+                <w:rStyle w:val="Hyperlink"/>
+                <w:noProof/>
+              </w:rPr>
+              <w:t>Platform specifications</w:t>
+            </w:r>
+            <w:r>
+              <w:rPr>
+                <w:noProof/>
+                <w:webHidden/>
+              </w:rPr>
+              <w:tab/>
+            </w:r>
+            <w:r>
+              <w:rPr>
+                <w:noProof/>
+                <w:webHidden/>
+              </w:rPr>
+              <w:fldChar w:fldCharType="begin"/>
+            </w:r>
+            <w:r>
+              <w:rPr>
+                <w:noProof/>
+                <w:webHidden/>
+              </w:rPr>
+              <w:instrText xml:space="preserve"> PAGEREF _Toc208332752 \h </w:instrText>
+            </w:r>
+            <w:r>
+              <w:rPr>
+                <w:noProof/>
+                <w:webHidden/>
+              </w:rPr>
+            </w:r>
+            <w:r>
+              <w:rPr>
+                <w:noProof/>
+                <w:webHidden/>
+              </w:rPr>
+              <w:fldChar w:fldCharType="separate"/>
+            </w:r>
+            <w:r>
+              <w:rPr>
+                <w:noProof/>
+                <w:webHidden/>
+              </w:rPr>
+              <w:t>5</w:t>
+            </w:r>
+            <w:r>
+              <w:rPr>
+                <w:noProof/>
+                <w:webHidden/>
+              </w:rPr>
+              <w:fldChar w:fldCharType="end"/>
+            </w:r>
+          </w:hyperlink>
+        </w:p>
+        <w:p>
+          <w:pPr>
+            <w:pStyle w:val="TOC3"/>
+            <w:tabs>
+              <w:tab w:val="right" w:leader="dot" w:pos="9016"/>
+            </w:tabs>
+            <w:rPr>
+              <w:rFonts w:eastAsiaTheme="minorEastAsia"/>
+              <w:noProof/>
+              <w:lang w:eastAsia="en-GB"/>
+            </w:rPr>
+          </w:pPr>
+          <w:hyperlink w:anchor="_Toc208332753" w:history="1">
+            <w:r>
+              <w:rPr>
+                <w:rStyle w:val="Hyperlink"/>
+                <w:noProof/>
+              </w:rPr>
+              <w:t>Flutter Research</w:t>
+            </w:r>
+            <w:r>
+              <w:rPr>
+                <w:noProof/>
+                <w:webHidden/>
+              </w:rPr>
+              <w:tab/>
+            </w:r>
+            <w:r>
+              <w:rPr>
+                <w:noProof/>
+                <w:webHidden/>
+              </w:rPr>
+              <w:fldChar w:fldCharType="begin"/>
+            </w:r>
+            <w:r>
+              <w:rPr>
+                <w:noProof/>
+                <w:webHidden/>
+              </w:rPr>
+              <w:instrText xml:space="preserve"> PAGEREF _Toc208332753 \h </w:instrText>
+            </w:r>
+            <w:r>
+              <w:rPr>
+                <w:noProof/>
+                <w:webHidden/>
+              </w:rPr>
+            </w:r>
+            <w:r>
+              <w:rPr>
+                <w:noProof/>
+                <w:webHidden/>
+              </w:rPr>
+              <w:fldChar w:fldCharType="separate"/>
+            </w:r>
+            <w:r>
+              <w:rPr>
+                <w:noProof/>
+                <w:webHidden/>
+              </w:rPr>
+              <w:t>5</w:t>
+            </w:r>
+            <w:r>
+              <w:rPr>
+                <w:noProof/>
+                <w:webHidden/>
+              </w:rPr>
+              <w:fldChar w:fldCharType="end"/>
+            </w:r>
+          </w:hyperlink>
+        </w:p>
+        <w:p>
+          <w:pPr>
+            <w:pStyle w:val="TOC1"/>
+            <w:tabs>
+              <w:tab w:val="right" w:leader="dot" w:pos="9016"/>
+            </w:tabs>
+            <w:rPr>
+              <w:rFonts w:eastAsiaTheme="minorEastAsia"/>
+              <w:noProof/>
+              <w:lang w:eastAsia="en-GB"/>
+            </w:rPr>
+          </w:pPr>
+          <w:hyperlink w:anchor="_Toc208332754" w:history="1">
+            <w:r>
+              <w:rPr>
+                <w:rStyle w:val="Hyperlink"/>
+                <w:noProof/>
+              </w:rPr>
+              <w:t>Design</w:t>
+            </w:r>
+            <w:r>
+              <w:rPr>
+                <w:noProof/>
+                <w:webHidden/>
+              </w:rPr>
+              <w:tab/>
+            </w:r>
+            <w:r>
+              <w:rPr>
+                <w:noProof/>
+                <w:webHidden/>
+              </w:rPr>
+              <w:fldChar w:fldCharType="begin"/>
+            </w:r>
+            <w:r>
+              <w:rPr>
+                <w:noProof/>
+                <w:webHidden/>
+              </w:rPr>
+              <w:instrText xml:space="preserve"> PAGEREF _Toc208332754 \h </w:instrText>
+            </w:r>
+            <w:r>
+              <w:rPr>
+                <w:noProof/>
+                <w:webHidden/>
+              </w:rPr>
+            </w:r>
+            <w:r>
+              <w:rPr>
+                <w:noProof/>
+                <w:webHidden/>
+              </w:rPr>
+              <w:fldChar w:fldCharType="separate"/>
+            </w:r>
+            <w:r>
+              <w:rPr>
+                <w:noProof/>
+                <w:webHidden/>
+              </w:rPr>
+              <w:t>5</w:t>
+            </w:r>
+            <w:r>
+              <w:rPr>
+                <w:noProof/>
+                <w:webHidden/>
+              </w:rPr>
+              <w:fldChar w:fldCharType="end"/>
+            </w:r>
+          </w:hyperlink>
+        </w:p>
+        <w:p>
+          <w:pPr>
+            <w:pStyle w:val="TOC2"/>
+            <w:tabs>
+              <w:tab w:val="right" w:leader="dot" w:pos="9016"/>
+            </w:tabs>
+            <w:rPr>
+              <w:rFonts w:eastAsiaTheme="minorEastAsia"/>
+              <w:noProof/>
+              <w:lang w:eastAsia="en-GB"/>
+            </w:rPr>
+          </w:pPr>
+          <w:hyperlink w:anchor="_Toc208332755" w:history="1">
+            <w:r>
+              <w:rPr>
+                <w:rStyle w:val="Hyperlink"/>
+                <w:noProof/>
+              </w:rPr>
+              <w:t>Interface Design</w:t>
+            </w:r>
+            <w:r>
+              <w:rPr>
+                <w:noProof/>
+                <w:webHidden/>
+              </w:rPr>
+              <w:tab/>
+            </w:r>
+            <w:r>
+              <w:rPr>
+                <w:noProof/>
+                <w:webHidden/>
+              </w:rPr>
+              <w:fldChar w:fldCharType="begin"/>
+            </w:r>
+            <w:r>
+              <w:rPr>
+                <w:noProof/>
+                <w:webHidden/>
+              </w:rPr>
+              <w:instrText xml:space="preserve"> PAGEREF _Toc208332755 \h </w:instrText>
+            </w:r>
+            <w:r>
+              <w:rPr>
+                <w:noProof/>
+                <w:webHidden/>
+              </w:rPr>
+            </w:r>
+            <w:r>
+              <w:rPr>
+                <w:noProof/>
+                <w:webHidden/>
+              </w:rPr>
+              <w:fldChar w:fldCharType="separate"/>
+            </w:r>
+            <w:r>
+              <w:rPr>
+                <w:noProof/>
+                <w:webHidden/>
+              </w:rPr>
+              <w:t>5</w:t>
+            </w:r>
+            <w:r>
+              <w:rPr>
+                <w:noProof/>
+                <w:webHidden/>
+              </w:rPr>
+              <w:fldChar w:fldCharType="end"/>
+            </w:r>
+          </w:hyperlink>
+        </w:p>
+        <w:p>
+          <w:pPr>
+            <w:pStyle w:val="TOC3"/>
+            <w:tabs>
+              <w:tab w:val="right" w:leader="dot" w:pos="9016"/>
+            </w:tabs>
+            <w:rPr>
+              <w:rFonts w:eastAsiaTheme="minorEastAsia"/>
+              <w:noProof/>
+              <w:lang w:eastAsia="en-GB"/>
+            </w:rPr>
+          </w:pPr>
+          <w:hyperlink w:anchor="_Toc208332756" w:history="1">
+            <w:r>
+              <w:rPr>
+                <w:rStyle w:val="Hyperlink"/>
+                <w:noProof/>
+              </w:rPr>
+              <w:t>First Iteration</w:t>
+            </w:r>
+            <w:r>
+              <w:rPr>
+                <w:noProof/>
+                <w:webHidden/>
+              </w:rPr>
+              <w:tab/>
+            </w:r>
+            <w:r>
+              <w:rPr>
+                <w:noProof/>
+                <w:webHidden/>
+              </w:rPr>
+              <w:fldChar w:fldCharType="begin"/>
+            </w:r>
+            <w:r>
+              <w:rPr>
+                <w:noProof/>
+                <w:webHidden/>
+              </w:rPr>
+              <w:instrText xml:space="preserve"> PAGEREF _Toc208332756 \h </w:instrText>
+            </w:r>
+            <w:r>
+              <w:rPr>
+                <w:noProof/>
+                <w:webHidden/>
+              </w:rPr>
+            </w:r>
+            <w:r>
+              <w:rPr>
+                <w:noProof/>
+                <w:webHidden/>
+              </w:rPr>
+              <w:fldChar w:fldCharType="separate"/>
+            </w:r>
+            <w:r>
+              <w:rPr>
+                <w:noProof/>
+                <w:webHidden/>
+              </w:rPr>
+              <w:t>6</w:t>
+            </w:r>
+            <w:r>
+              <w:rPr>
+                <w:noProof/>
+                <w:webHidden/>
+              </w:rPr>
+              <w:fldChar w:fldCharType="end"/>
+            </w:r>
+          </w:hyperlink>
+        </w:p>
+        <w:p>
+          <w:pPr>
+            <w:pStyle w:val="TOC1"/>
+            <w:tabs>
+              <w:tab w:val="right" w:leader="dot" w:pos="9016"/>
+            </w:tabs>
+            <w:rPr>
+              <w:rFonts w:eastAsiaTheme="minorEastAsia"/>
+              <w:noProof/>
+              <w:lang w:eastAsia="en-GB"/>
+            </w:rPr>
+          </w:pPr>
+          <w:hyperlink w:anchor="_Toc208332757" w:history="1">
+            <w:r>
+              <w:rPr>
+                <w:rStyle w:val="Hyperlink"/>
+                <w:noProof/>
+              </w:rPr>
+              <w:t>Implementation</w:t>
+            </w:r>
+            <w:r>
+              <w:rPr>
+                <w:noProof/>
+                <w:webHidden/>
+              </w:rPr>
+              <w:tab/>
+            </w:r>
+            <w:r>
+              <w:rPr>
+                <w:noProof/>
+                <w:webHidden/>
+              </w:rPr>
+              <w:fldChar w:fldCharType="begin"/>
+            </w:r>
+            <w:r>
+              <w:rPr>
+                <w:noProof/>
+                <w:webHidden/>
+              </w:rPr>
+              <w:instrText xml:space="preserve"> PAGEREF _Toc208332757 \h </w:instrText>
+            </w:r>
+            <w:r>
+              <w:rPr>
+                <w:noProof/>
+                <w:webHidden/>
+              </w:rPr>
+            </w:r>
+            <w:r>
+              <w:rPr>
+                <w:noProof/>
+                <w:webHidden/>
+              </w:rPr>
+              <w:fldChar w:fldCharType="separate"/>
+            </w:r>
+            <w:r>
+              <w:rPr>
+                <w:noProof/>
+                <w:webHidden/>
+              </w:rPr>
+              <w:t>6</w:t>
+            </w:r>
+            <w:r>
+              <w:rPr>
+                <w:noProof/>
+                <w:webHidden/>
+              </w:rPr>
+              <w:fldChar w:fldCharType="end"/>
+            </w:r>
+          </w:hyperlink>
+        </w:p>
+        <w:p>
+          <w:pPr>
+            <w:pStyle w:val="TOC1"/>
+            <w:tabs>
+              <w:tab w:val="right" w:leader="dot" w:pos="9016"/>
+            </w:tabs>
+            <w:rPr>
+              <w:rFonts w:eastAsiaTheme="minorEastAsia"/>
+              <w:noProof/>
+              <w:lang w:eastAsia="en-GB"/>
+            </w:rPr>
+          </w:pPr>
+          <w:hyperlink w:anchor="_Toc208332758" w:history="1">
+            <w:r>
+              <w:rPr>
+                <w:rStyle w:val="Hyperlink"/>
+                <w:noProof/>
+              </w:rPr>
+              <w:t>Testing</w:t>
+            </w:r>
+            <w:r>
+              <w:rPr>
+                <w:noProof/>
+                <w:webHidden/>
+              </w:rPr>
+              <w:tab/>
+            </w:r>
+            <w:r>
+              <w:rPr>
+                <w:noProof/>
+                <w:webHidden/>
+              </w:rPr>
+              <w:fldChar w:fldCharType="begin"/>
+            </w:r>
+            <w:r>
+              <w:rPr>
+                <w:noProof/>
+                <w:webHidden/>
+              </w:rPr>
+              <w:instrText xml:space="preserve"> PAGEREF _Toc208332758 \h </w:instrText>
+            </w:r>
+            <w:r>
+              <w:rPr>
+                <w:noProof/>
+                <w:webHidden/>
+              </w:rPr>
+            </w:r>
+            <w:r>
+              <w:rPr>
+                <w:noProof/>
+                <w:webHidden/>
+              </w:rPr>
+              <w:fldChar w:fldCharType="separate"/>
+            </w:r>
+            <w:r>
+              <w:rPr>
+                <w:noProof/>
+                <w:webHidden/>
+              </w:rPr>
+              <w:t>6</w:t>
+            </w:r>
+            <w:r>
+              <w:rPr>
+                <w:noProof/>
+                <w:webHidden/>
+              </w:rPr>
+              <w:fldChar w:fldCharType="end"/>
+            </w:r>
+          </w:hyperlink>
+        </w:p>
+        <w:p>
+          <w:pPr>
+            <w:pStyle w:val="TOC1"/>
+            <w:tabs>
+              <w:tab w:val="right" w:leader="dot" w:pos="9016"/>
+            </w:tabs>
+            <w:rPr>
+              <w:rFonts w:eastAsiaTheme="minorEastAsia"/>
+              <w:noProof/>
+              <w:lang w:eastAsia="en-GB"/>
+            </w:rPr>
+          </w:pPr>
+          <w:hyperlink w:anchor="_Toc208332759" w:history="1">
+            <w:r>
+              <w:rPr>
+                <w:rStyle w:val="Hyperlink"/>
+                <w:noProof/>
+              </w:rPr>
+              <w:t>Conclusion</w:t>
+            </w:r>
+            <w:r>
+              <w:rPr>
+                <w:noProof/>
+                <w:webHidden/>
+              </w:rPr>
+              <w:tab/>
+            </w:r>
+            <w:r>
+              <w:rPr>
+                <w:noProof/>
+                <w:webHidden/>
+              </w:rPr>
+              <w:fldChar w:fldCharType="begin"/>
+            </w:r>
+            <w:r>
+              <w:rPr>
+                <w:noProof/>
+                <w:webHidden/>
+              </w:rPr>
+              <w:instrText xml:space="preserve"> PAGEREF _Toc208332759 \h </w:instrText>
+            </w:r>
+            <w:r>
+              <w:rPr>
+                <w:noProof/>
+                <w:webHidden/>
+              </w:rPr>
+            </w:r>
+            <w:r>
+              <w:rPr>
+                <w:noProof/>
+                <w:webHidden/>
+              </w:rPr>
+              <w:fldChar w:fldCharType="separate"/>
+            </w:r>
+            <w:r>
+              <w:rPr>
+                <w:noProof/>
+                <w:webHidden/>
+              </w:rPr>
+              <w:t>6</w:t>
+            </w:r>
+            <w:r>
+              <w:rPr>
+                <w:noProof/>
+                <w:webHidden/>
+              </w:rPr>
+              <w:fldChar w:fldCharType="end"/>
+            </w:r>
+          </w:hyperlink>
+        </w:p>
+        <w:p>
+          <w:r>
+            <w:rPr>
+              <w:b/>
+              <w:bCs/>
+              <w:noProof/>
+            </w:rPr>
+            <w:fldChar w:fldCharType="end"/>
+          </w:r>
+        </w:p>
+      </w:sdtContent>
+    </w:sdt>
     <w:p>
       <w:pPr>
         <w:pStyle w:val="Heading1"/>
       </w:pPr>
+      <w:bookmarkStart w:id="0" w:name="_Toc208332742"/>
+      <w:r>
+        <w:t>Purpose</w:t>
+      </w:r>
+      <w:bookmarkEnd w:id="0"/>
+    </w:p>
+    <w:p>
+      <w:pPr>
+        <w:pStyle w:val="Heading2"/>
+      </w:pPr>
+      <w:bookmarkStart w:id="1" w:name="_Toc208332743"/>
       <w:r>
         <w:t>Introduction</w:t>
       </w:r>
-    </w:p>
-    <w:p>
-      <w:r>
-        <w:t>The purpose of this project is to build a simple, easy to use interface for planning out your day/week/month. As someone who uses to-do lists daily, this would greatly increase my productivity.</w:t>
-      </w:r>
-    </w:p>
-    <w:p>
-      <w:r>
-        <w:t>Must have a somewhat aesthetic design, simple functionality for understandability and notifications for reminders.</w:t>
-      </w:r>
-    </w:p>
+      <w:bookmarkEnd w:id="1"/>
+    </w:p>
+    <w:p>
+      <w:r>
+        <w:t xml:space="preserve">The purpose of this project is to build a simple, </w:t>
+      </w:r>
+      <w:r>
+        <w:t>intuitive</w:t>
+      </w:r>
+      <w:r>
+        <w:t xml:space="preserve"> interface for planning da</w:t>
+      </w:r>
+      <w:r>
+        <w:t xml:space="preserve">ily, weekly, or </w:t>
+      </w:r>
+      <w:r>
+        <w:t>month</w:t>
+      </w:r>
+      <w:r>
+        <w:t>ly tasks</w:t>
+      </w:r>
+      <w:r>
+        <w:t>. As someone who uses to-do lists</w:t>
+      </w:r>
+      <w:r>
+        <w:t xml:space="preserve"> frequently</w:t>
+      </w:r>
+      <w:r>
+        <w:t>, this would greatly increase my productivity.</w:t>
+      </w:r>
+    </w:p>
+    <w:p>
+      <w:r>
+        <w:lastRenderedPageBreak/>
+        <w:t>The app m</w:t>
+      </w:r>
+      <w:r>
+        <w:t xml:space="preserve">ust </w:t>
+      </w:r>
+      <w:r>
+        <w:t>feature</w:t>
+      </w:r>
+      <w:r>
+        <w:t xml:space="preserve"> a somewhat aesthetic design, s</w:t>
+      </w:r>
+      <w:r>
+        <w:t>traightforward</w:t>
+      </w:r>
+      <w:r>
+        <w:t xml:space="preserve"> functionality for understandability and notifications for reminders.</w:t>
+      </w:r>
+    </w:p>
+    <w:p/>
+    <w:p>
+      <w:pPr>
+        <w:pStyle w:val="Heading2"/>
+      </w:pPr>
+      <w:bookmarkStart w:id="2" w:name="_Toc208332744"/>
+      <w:r>
+        <w:t xml:space="preserve">The </w:t>
+      </w:r>
+      <w:r>
+        <w:t>Problem</w:t>
+      </w:r>
+      <w:bookmarkEnd w:id="2"/>
+    </w:p>
+    <w:p>
+      <w:r>
+        <w:t>Today</w:t>
+      </w:r>
+      <w:r>
+        <w:t>,</w:t>
+      </w:r>
+      <w:r>
+        <w:t xml:space="preserve"> people are constantly busy with different tasks and obligations. To-do lists help by </w:t>
+      </w:r>
+      <w:r>
+        <w:t>reducing the load by taking out the memory part.</w:t>
+      </w:r>
+      <w:r>
+        <w:t xml:space="preserve"> A study from Forbes </w:t>
+      </w:r>
+      <w:r>
+        <w:t>found that</w:t>
+      </w:r>
+      <w:r>
+        <w:t xml:space="preserve"> 47% of people have a lengthy to-do list on most days.</w:t>
+      </w:r>
+    </w:p>
+    <w:p>
+      <w:r>
+        <w:t xml:space="preserve">However, many existing apps </w:t>
+      </w:r>
+      <w:r>
+        <w:t>often</w:t>
+      </w:r>
+      <w:r>
+        <w:t xml:space="preserve"> have</w:t>
+      </w:r>
+      <w:r>
+        <w:t xml:space="preserve"> quite an expensive pay wall, or the interface may be too complex and overbearing, pushing users away.</w:t>
+      </w:r>
+      <w:r>
+        <w:t xml:space="preserve"> </w:t>
+      </w:r>
+      <w:r>
+        <w:t xml:space="preserve">I want to create an app that is free and extremely easy to understand and use. However, along the road </w:t>
+      </w:r>
+      <w:r>
+        <w:t xml:space="preserve">a </w:t>
+      </w:r>
+      <w:r>
+        <w:t>premium</w:t>
+      </w:r>
+      <w:r>
+        <w:t xml:space="preserve"> version could be created with exclusive features and benefits.</w:t>
+      </w:r>
+    </w:p>
+    <w:p/>
     <w:p>
       <w:pPr>
         <w:pStyle w:val="Heading1"/>
       </w:pPr>
-      <w:r>
-        <w:t xml:space="preserve">The </w:t>
-      </w:r>
-      <w:r>
-        <w:t>Problem</w:t>
-      </w:r>
-    </w:p>
-    <w:p>
-      <w:r>
-        <w:t>In today’s society people are constantly busy with different tasks and obligations. To-do lists help by taking the memory part of this. A study from Forbes showed 47% of people have a lengthy to-do list on most days.</w:t>
-      </w:r>
-    </w:p>
-    <w:p>
-      <w:r>
-        <w:t>In current apps, there is often quite an expensive pay wall, or the interface may be too complex and overbearing, pushing users away.</w:t>
-      </w:r>
-    </w:p>
-    <w:p>
-      <w:r>
-        <w:t xml:space="preserve">I want to create an app that is free and extremely easy to understand and use. However, along the road </w:t>
-      </w:r>
-      <w:r>
-        <w:t>a paid version could be created with exclusive features and benefits.</w:t>
-      </w:r>
-    </w:p>
-    <w:p>
-      <w:pPr>
-        <w:pStyle w:val="Heading1"/>
-      </w:pPr>
+      <w:bookmarkStart w:id="3" w:name="_Toc208332745"/>
+      <w:r>
+        <w:t>Analysis</w:t>
+      </w:r>
+      <w:bookmarkEnd w:id="3"/>
+    </w:p>
+    <w:p>
+      <w:pPr>
+        <w:pStyle w:val="Heading2"/>
+      </w:pPr>
+      <w:bookmarkStart w:id="4" w:name="_Toc208332746"/>
       <w:r>
         <w:t>Target Users</w:t>
       </w:r>
+      <w:bookmarkEnd w:id="4"/>
     </w:p>
     <w:p>
       <w:pPr>
@@ -149,38 +1566,48 @@
         <w:t>, which is everyone.</w:t>
       </w:r>
     </w:p>
-    <w:p>
-      <w:pPr>
-        <w:pStyle w:val="Heading1"/>
-      </w:pPr>
+    <w:p/>
+    <w:p>
+      <w:pPr>
+        <w:pStyle w:val="Heading2"/>
+      </w:pPr>
+      <w:bookmarkStart w:id="5" w:name="_Toc208332747"/>
       <w:r>
         <w:lastRenderedPageBreak/>
         <w:t>Other implementations</w:t>
       </w:r>
-    </w:p>
-    <w:p>
-      <w:pPr>
-        <w:pStyle w:val="Heading2"/>
-      </w:pPr>
+      <w:bookmarkEnd w:id="5"/>
+    </w:p>
+    <w:p>
+      <w:pPr>
+        <w:pStyle w:val="Heading3"/>
+      </w:pPr>
+      <w:bookmarkStart w:id="6" w:name="_Toc208332748"/>
       <w:r>
         <w:t xml:space="preserve">Example One – </w:t>
       </w:r>
       <w:r>
         <w:t>‘</w:t>
       </w:r>
+      <w:proofErr w:type="spellStart"/>
       <w:r>
         <w:t>Todoist</w:t>
       </w:r>
+      <w:proofErr w:type="spellEnd"/>
       <w:r>
         <w:t>’</w:t>
       </w:r>
-    </w:p>
-    <w:p>
-      <w:r>
+      <w:bookmarkEnd w:id="6"/>
+    </w:p>
+    <w:p>
+      <w:r>
+        <w:rPr>
+          <w:noProof/>
+        </w:rPr>
         <w:drawing>
-          <wp:inline distT="0" distB="0" distL="0" distR="0" wp14:anchorId="13AE9D9E" wp14:editId="6FA8ADCF">
-            <wp:extent cx="5731510" cy="2914015"/>
-            <wp:effectExtent l="0" t="0" r="2540" b="635"/>
+          <wp:inline distT="0" distB="0" distL="0" distR="0" wp14:anchorId="13AE9D9E" wp14:editId="787029DD">
+            <wp:extent cx="6116817" cy="3109913"/>
+            <wp:effectExtent l="0" t="0" r="0" b="0"/>
             <wp:docPr id="835901365" name="Picture 1" descr="A screenshot of a computer&#10;&#10;AI-generated content may be incorrect."/>
             <wp:cNvGraphicFramePr>
               <a:graphicFrameLocks xmlns:a="http://schemas.openxmlformats.org/drawingml/2006/main" noChangeAspect="1"/>
@@ -193,7 +1620,7 @@
                     <pic:cNvPicPr/>
                   </pic:nvPicPr>
                   <pic:blipFill>
-                    <a:blip r:embed="rId5"/>
+                    <a:blip r:embed="rId6"/>
                     <a:stretch>
                       <a:fillRect/>
                     </a:stretch>
@@ -201,7 +1628,7 @@
                   <pic:spPr>
                     <a:xfrm>
                       <a:off x="0" y="0"/>
-                      <a:ext cx="5731510" cy="2914015"/>
+                      <a:ext cx="6122020" cy="3112558"/>
                     </a:xfrm>
                     <a:prstGeom prst="rect">
                       <a:avLst/>
@@ -216,40 +1643,734 @@
     </w:p>
     <w:p>
       <w:r>
-        <w:t>From this example, they utilise priorities, setting dates and reminders, which are some key elements I have to consider. I also really like the user interface, I think it is quite simple yet aesthetic. However, completed tasks go into a ‘Completed’ section, which I am not a fan of.</w:t>
-      </w:r>
-    </w:p>
+        <w:t>The features I like about this example are:</w:t>
+      </w:r>
+    </w:p>
+    <w:p>
+      <w:pPr>
+        <w:pStyle w:val="ListParagraph"/>
+        <w:numPr>
+          <w:ilvl w:val="0"/>
+          <w:numId w:val="10"/>
+        </w:numPr>
+      </w:pPr>
+      <w:r>
+        <w:t xml:space="preserve">How </w:t>
+      </w:r>
+      <w:r>
+        <w:t>they utilise priorities,</w:t>
+      </w:r>
+      <w:r>
+        <w:t xml:space="preserve"> there are 4 different options to choose from, indicated by the colours.</w:t>
+      </w:r>
+      <w:r>
+        <w:t xml:space="preserve"> </w:t>
+      </w:r>
+    </w:p>
+    <w:p>
+      <w:pPr>
+        <w:pStyle w:val="ListParagraph"/>
+        <w:numPr>
+          <w:ilvl w:val="0"/>
+          <w:numId w:val="10"/>
+        </w:numPr>
+      </w:pPr>
+      <w:r>
+        <w:t>S</w:t>
+      </w:r>
+      <w:r>
+        <w:t>etting dates</w:t>
+      </w:r>
+      <w:r>
+        <w:t xml:space="preserve"> for tasks</w:t>
+      </w:r>
+      <w:r>
+        <w:t xml:space="preserve"> and reminders, which are some key elements I </w:t>
+      </w:r>
+      <w:r>
+        <w:t>must</w:t>
+      </w:r>
+      <w:r>
+        <w:t xml:space="preserve"> consider.</w:t>
+      </w:r>
+    </w:p>
+    <w:p>
+      <w:pPr>
+        <w:pStyle w:val="ListParagraph"/>
+        <w:numPr>
+          <w:ilvl w:val="0"/>
+          <w:numId w:val="10"/>
+        </w:numPr>
+      </w:pPr>
+      <w:r>
+        <w:t xml:space="preserve">I also really like the user </w:t>
+      </w:r>
+      <w:proofErr w:type="gramStart"/>
+      <w:r>
+        <w:t>interface,</w:t>
+      </w:r>
+      <w:proofErr w:type="gramEnd"/>
+      <w:r>
+        <w:t xml:space="preserve"> I think it is quite simple yet aesthetic. </w:t>
+      </w:r>
+    </w:p>
+    <w:p>
+      <w:r>
+        <w:t>However, completed tasks go into a ‘Completed’ section, which I am not a fan of.</w:t>
+      </w:r>
+      <w:r>
+        <w:t xml:space="preserve"> I think they should remain on the same screen, so users get a sense of completion. Also, if they wish to mark them as uncomplete after it is easier if it’s on the same menu.</w:t>
+      </w:r>
+    </w:p>
+    <w:p>
+      <w:pPr>
+        <w:pStyle w:val="Heading3"/>
+      </w:pPr>
+      <w:bookmarkStart w:id="7" w:name="_Toc208332749"/>
+      <w:r>
+        <w:lastRenderedPageBreak/>
+        <w:t xml:space="preserve">Example Two – ‘Microsoft </w:t>
+      </w:r>
+      <w:proofErr w:type="gramStart"/>
+      <w:r>
+        <w:t>To</w:t>
+      </w:r>
+      <w:proofErr w:type="gramEnd"/>
+      <w:r>
+        <w:t xml:space="preserve"> Do’</w:t>
+      </w:r>
+      <w:bookmarkEnd w:id="7"/>
+    </w:p>
+    <w:p>
+      <w:r>
+        <w:rPr>
+          <w:noProof/>
+        </w:rPr>
+        <w:drawing>
+          <wp:inline distT="0" distB="0" distL="0" distR="0" wp14:anchorId="4242BB1A" wp14:editId="3FD1F403">
+            <wp:extent cx="6076950" cy="4435990"/>
+            <wp:effectExtent l="0" t="0" r="0" b="3175"/>
+            <wp:docPr id="2101288251" name="Picture 1"/>
+            <wp:cNvGraphicFramePr>
+              <a:graphicFrameLocks xmlns:a="http://schemas.openxmlformats.org/drawingml/2006/main" noChangeAspect="1"/>
+            </wp:cNvGraphicFramePr>
+            <a:graphic xmlns:a="http://schemas.openxmlformats.org/drawingml/2006/main">
+              <a:graphicData uri="http://schemas.openxmlformats.org/drawingml/2006/picture">
+                <pic:pic xmlns:pic="http://schemas.openxmlformats.org/drawingml/2006/picture">
+                  <pic:nvPicPr>
+                    <pic:cNvPr id="2101288251" name="Picture 1"/>
+                    <pic:cNvPicPr/>
+                  </pic:nvPicPr>
+                  <pic:blipFill rotWithShape="1">
+                    <a:blip r:embed="rId7" cstate="print">
+                      <a:extLst>
+                        <a:ext uri="{28A0092B-C50C-407E-A947-70E740481C1C}">
+                          <a14:useLocalDpi xmlns:a14="http://schemas.microsoft.com/office/drawing/2010/main" val="0"/>
+                        </a:ext>
+                      </a:extLst>
+                    </a:blip>
+                    <a:srcRect l="748" t="1802"/>
+                    <a:stretch>
+                      <a:fillRect/>
+                    </a:stretch>
+                  </pic:blipFill>
+                  <pic:spPr bwMode="auto">
+                    <a:xfrm>
+                      <a:off x="0" y="0"/>
+                      <a:ext cx="6086550" cy="4442998"/>
+                    </a:xfrm>
+                    <a:prstGeom prst="rect">
+                      <a:avLst/>
+                    </a:prstGeom>
+                    <a:ln>
+                      <a:noFill/>
+                    </a:ln>
+                    <a:extLst>
+                      <a:ext uri="{53640926-AAD7-44D8-BBD7-CCE9431645EC}">
+                        <a14:shadowObscured xmlns:a14="http://schemas.microsoft.com/office/drawing/2010/main"/>
+                      </a:ext>
+                    </a:extLst>
+                  </pic:spPr>
+                </pic:pic>
+              </a:graphicData>
+            </a:graphic>
+          </wp:inline>
+        </w:drawing>
+      </w:r>
+    </w:p>
+    <w:p>
+      <w:r>
+        <w:t>The features I like about this example are:</w:t>
+      </w:r>
+    </w:p>
+    <w:p>
+      <w:pPr>
+        <w:pStyle w:val="ListParagraph"/>
+        <w:numPr>
+          <w:ilvl w:val="0"/>
+          <w:numId w:val="9"/>
+        </w:numPr>
+      </w:pPr>
+      <w:r>
+        <w:t>You can create multiple lists for different projects/tasks</w:t>
+      </w:r>
+    </w:p>
+    <w:p>
+      <w:pPr>
+        <w:pStyle w:val="ListParagraph"/>
+        <w:numPr>
+          <w:ilvl w:val="0"/>
+          <w:numId w:val="9"/>
+        </w:numPr>
+      </w:pPr>
+      <w:r>
+        <w:t xml:space="preserve">You can create subtasks within a task, as often bigger problems have smaller parts to them. For </w:t>
+      </w:r>
+      <w:r>
+        <w:t>instance,</w:t>
+      </w:r>
+      <w:r>
+        <w:t xml:space="preserve"> fixing a car, smaller subtasks could be checking the engine oil, testing the brakes etc.</w:t>
+      </w:r>
+    </w:p>
+    <w:p>
+      <w:pPr>
+        <w:pStyle w:val="ListParagraph"/>
+        <w:numPr>
+          <w:ilvl w:val="0"/>
+          <w:numId w:val="9"/>
+        </w:numPr>
+      </w:pPr>
+      <w:r>
+        <w:t xml:space="preserve">I also like how they’ve done the completed </w:t>
+      </w:r>
+      <w:r>
+        <w:t>section;</w:t>
+      </w:r>
+      <w:r>
+        <w:t xml:space="preserve"> it stays on the same page so there isn’t a separate section.</w:t>
+      </w:r>
+    </w:p>
+    <w:p>
+      <w:r>
+        <w:t xml:space="preserve">However, I don’t like how the priority works on this example. You can mark tasks as important but that’s it. </w:t>
+      </w:r>
+      <w:r>
+        <w:t>I also don’t like the aesthetic</w:t>
+      </w:r>
+      <w:r>
+        <w:t>, I feel it is too blocky. However I do like that you can choose your own background, I could implement this in some way, even if it’s just the colours.</w:t>
+      </w:r>
+    </w:p>
+    <w:p/>
+    <w:p>
+      <w:pPr>
+        <w:pStyle w:val="Heading2"/>
+      </w:pPr>
+      <w:bookmarkStart w:id="8" w:name="_Toc208332750"/>
+      <w:r>
+        <w:t>Feature Requirements</w:t>
+      </w:r>
+      <w:bookmarkEnd w:id="8"/>
+    </w:p>
+    <w:p>
+      <w:pPr>
+        <w:pStyle w:val="ListParagraph"/>
+        <w:numPr>
+          <w:ilvl w:val="0"/>
+          <w:numId w:val="11"/>
+        </w:numPr>
+      </w:pPr>
+      <w:r>
+        <w:t>Priority levels for each task, tasks can be colour coded to indicate this, and tasks must be in priority order.</w:t>
+      </w:r>
+    </w:p>
+    <w:p>
+      <w:pPr>
+        <w:pStyle w:val="ListParagraph"/>
+        <w:numPr>
+          <w:ilvl w:val="0"/>
+          <w:numId w:val="11"/>
+        </w:numPr>
+      </w:pPr>
+      <w:r>
+        <w:t>Multiple lists.</w:t>
+      </w:r>
+    </w:p>
+    <w:p>
+      <w:pPr>
+        <w:pStyle w:val="ListParagraph"/>
+        <w:numPr>
+          <w:ilvl w:val="0"/>
+          <w:numId w:val="11"/>
+        </w:numPr>
+      </w:pPr>
+      <w:r>
+        <w:lastRenderedPageBreak/>
+        <w:t>Ability to set dates for tasks, or date for a list if it is a project (could use a toggle for this).</w:t>
+      </w:r>
+    </w:p>
+    <w:p>
+      <w:pPr>
+        <w:pStyle w:val="ListParagraph"/>
+        <w:numPr>
+          <w:ilvl w:val="0"/>
+          <w:numId w:val="11"/>
+        </w:numPr>
+      </w:pPr>
+      <w:r>
+        <w:t>Reminders and notifications for tasks due that day, this can be customised.</w:t>
+      </w:r>
+    </w:p>
+    <w:p>
+      <w:pPr>
+        <w:pStyle w:val="ListParagraph"/>
+        <w:numPr>
+          <w:ilvl w:val="0"/>
+          <w:numId w:val="11"/>
+        </w:numPr>
+      </w:pPr>
+      <w:r>
+        <w:t>Subtasks for each task.</w:t>
+      </w:r>
+    </w:p>
+    <w:p>
+      <w:pPr>
+        <w:pStyle w:val="ListParagraph"/>
+        <w:numPr>
+          <w:ilvl w:val="0"/>
+          <w:numId w:val="11"/>
+        </w:numPr>
+      </w:pPr>
+      <w:r>
+        <w:t>Completed tasks stay on same page, possibly until the next day.</w:t>
+      </w:r>
+    </w:p>
+    <w:p>
+      <w:pPr>
+        <w:pStyle w:val="ListParagraph"/>
+        <w:numPr>
+          <w:ilvl w:val="0"/>
+          <w:numId w:val="11"/>
+        </w:numPr>
+      </w:pPr>
+      <w:r>
+        <w:t>Simple yet aesthetic design.</w:t>
+      </w:r>
+    </w:p>
+    <w:p>
+      <w:pPr>
+        <w:pStyle w:val="ListParagraph"/>
+        <w:numPr>
+          <w:ilvl w:val="0"/>
+          <w:numId w:val="11"/>
+        </w:numPr>
+      </w:pPr>
+      <w:r>
+        <w:t>Save task statuses locally on phone.</w:t>
+      </w:r>
+    </w:p>
+    <w:p/>
+    <w:p>
+      <w:pPr>
+        <w:pStyle w:val="Heading2"/>
+      </w:pPr>
+      <w:bookmarkStart w:id="9" w:name="_Toc208332751"/>
+      <w:r>
+        <w:t>Technical Research</w:t>
+      </w:r>
+      <w:bookmarkEnd w:id="9"/>
+    </w:p>
+    <w:p>
+      <w:pPr>
+        <w:pStyle w:val="Heading3"/>
+      </w:pPr>
+      <w:bookmarkStart w:id="10" w:name="_Toc208332752"/>
+      <w:r>
+        <w:t>Platform specifications</w:t>
+      </w:r>
+      <w:bookmarkEnd w:id="10"/>
+    </w:p>
+    <w:p>
+      <w:r>
+        <w:t>Testing will be done on android, when this is complete the app must also be ready for IOS.</w:t>
+      </w:r>
+      <w:r>
+        <w:t xml:space="preserve"> From the above, it seems the Flutter development kit works quite well.</w:t>
+      </w:r>
+    </w:p>
+    <w:p/>
+    <w:p>
+      <w:pPr>
+        <w:pStyle w:val="Heading3"/>
+      </w:pPr>
+      <w:bookmarkStart w:id="11" w:name="_Toc208332753"/>
+      <w:r>
+        <w:t>Flutter Research</w:t>
+      </w:r>
+      <w:bookmarkEnd w:id="11"/>
+    </w:p>
+    <w:p>
+      <w:r>
+        <w:t xml:space="preserve">This uses a language called Dart, which I will need to research into, the learning curve should not be too steep as I already know some of Java. </w:t>
+      </w:r>
+    </w:p>
+    <w:p>
+      <w:r>
+        <w:t>It supports mobile apps for iOS and Android on a single codebase.</w:t>
+      </w:r>
+      <w:r>
+        <w:t xml:space="preserve"> The UI is also built from widgets that can be modified with Google’s material design system.</w:t>
+      </w:r>
+    </w:p>
+    <w:p>
+      <w:r>
+        <w:t>Flutter also allows Hot Reload, which allows you to see the changes live directly on your phone.</w:t>
+      </w:r>
+    </w:p>
+    <w:p/>
     <w:p>
       <w:pPr>
         <w:pStyle w:val="Heading1"/>
       </w:pPr>
-      <w:r>
-        <w:t>Feature Requirements</w:t>
-      </w:r>
-    </w:p>
+      <w:bookmarkStart w:id="12" w:name="_Toc208332754"/>
+      <w:r>
+        <w:t>Design</w:t>
+      </w:r>
+      <w:bookmarkEnd w:id="12"/>
+    </w:p>
+    <w:p>
+      <w:pPr>
+        <w:pStyle w:val="Heading2"/>
+      </w:pPr>
+      <w:bookmarkStart w:id="13" w:name="_Toc208332755"/>
+      <w:r>
+        <w:t xml:space="preserve">Interface </w:t>
+      </w:r>
+      <w:r>
+        <w:t>Design</w:t>
+      </w:r>
+      <w:bookmarkEnd w:id="13"/>
+    </w:p>
+    <w:p>
+      <w:r>
+        <w:t xml:space="preserve">Ideally, there needs to be a minimal </w:t>
+      </w:r>
+      <w:r>
+        <w:t>number</w:t>
+      </w:r>
+      <w:r>
+        <w:t xml:space="preserve"> of pages the user </w:t>
+      </w:r>
+      <w:proofErr w:type="gramStart"/>
+      <w:r>
+        <w:t>has to</w:t>
+      </w:r>
+      <w:proofErr w:type="gramEnd"/>
+      <w:r>
+        <w:t xml:space="preserve"> go through. For example, there could be </w:t>
+      </w:r>
+      <w:r>
+        <w:t>multiple identical</w:t>
+      </w:r>
+      <w:r>
+        <w:t xml:space="preserve"> page</w:t>
+      </w:r>
+      <w:r>
+        <w:t>s</w:t>
+      </w:r>
+      <w:r>
+        <w:t xml:space="preserve"> with </w:t>
+      </w:r>
+      <w:r>
+        <w:t>different</w:t>
+      </w:r>
+      <w:r>
+        <w:t xml:space="preserve"> list</w:t>
+      </w:r>
+      <w:r>
+        <w:t>s</w:t>
+      </w:r>
+      <w:r>
+        <w:t xml:space="preserve"> of tasks, with tasks on different days simply separated by a line break. I also think </w:t>
+      </w:r>
+      <w:r>
+        <w:t xml:space="preserve">completed tasks should be kept on screen, for example with a cross through it, this could be kept for up to a day before the task is removed from the home page. Another page could display all the completed tasks </w:t>
+      </w:r>
+      <w:r>
+        <w:t>overall;</w:t>
+      </w:r>
+      <w:r>
+        <w:t xml:space="preserve"> this could have a longer time to live. There also needs to be a page for selecting things like priority, date, name, subtasks etc. However, this could be a popup, minimising the </w:t>
+      </w:r>
+      <w:r>
+        <w:t>number</w:t>
+      </w:r>
+      <w:r>
+        <w:t xml:space="preserve"> of pages.</w:t>
+      </w:r>
+    </w:p>
+    <w:p/>
+    <w:p>
+      <w:pPr>
+        <w:pStyle w:val="Heading3"/>
+      </w:pPr>
+      <w:bookmarkStart w:id="14" w:name="_Toc208332756"/>
+      <w:r>
+        <w:lastRenderedPageBreak/>
+        <w:t>First Iteration</w:t>
+      </w:r>
+      <w:bookmarkEnd w:id="14"/>
+    </w:p>
+    <w:p>
+      <w:r>
+        <w:t>T</w:t>
+      </w:r>
+      <w:r>
+        <w:t>he elements:</w:t>
+      </w:r>
+    </w:p>
+    <w:p>
+      <w:pPr>
+        <w:pStyle w:val="ListParagraph"/>
+        <w:numPr>
+          <w:ilvl w:val="0"/>
+          <w:numId w:val="12"/>
+        </w:numPr>
+      </w:pPr>
+      <w:r>
+        <w:t>Main page</w:t>
+      </w:r>
+    </w:p>
+    <w:p>
+      <w:pPr>
+        <w:pStyle w:val="ListParagraph"/>
+        <w:numPr>
+          <w:ilvl w:val="1"/>
+          <w:numId w:val="12"/>
+        </w:numPr>
+      </w:pPr>
+      <w:r>
+        <w:t xml:space="preserve">Button for </w:t>
+      </w:r>
+      <w:r>
+        <w:t>creating list</w:t>
+      </w:r>
+    </w:p>
+    <w:p>
+      <w:pPr>
+        <w:pStyle w:val="ListParagraph"/>
+        <w:numPr>
+          <w:ilvl w:val="1"/>
+          <w:numId w:val="12"/>
+        </w:numPr>
+      </w:pPr>
+      <w:r>
+        <w:t>Button for switching between lists</w:t>
+      </w:r>
+    </w:p>
+    <w:p>
+      <w:pPr>
+        <w:pStyle w:val="ListParagraph"/>
+        <w:numPr>
+          <w:ilvl w:val="1"/>
+          <w:numId w:val="12"/>
+        </w:numPr>
+      </w:pPr>
+      <w:r>
+        <w:t>Button for editing list (name, date)</w:t>
+      </w:r>
+    </w:p>
+    <w:p>
+      <w:pPr>
+        <w:pStyle w:val="ListParagraph"/>
+        <w:numPr>
+          <w:ilvl w:val="1"/>
+          <w:numId w:val="12"/>
+        </w:numPr>
+      </w:pPr>
+      <w:r>
+        <w:t>Button for completing list</w:t>
+      </w:r>
+    </w:p>
+    <w:p>
+      <w:pPr>
+        <w:pStyle w:val="ListParagraph"/>
+        <w:numPr>
+          <w:ilvl w:val="1"/>
+          <w:numId w:val="12"/>
+        </w:numPr>
+      </w:pPr>
+      <w:r>
+        <w:t>Button for deleting list</w:t>
+      </w:r>
+    </w:p>
+    <w:p>
+      <w:pPr>
+        <w:pStyle w:val="ListParagraph"/>
+        <w:numPr>
+          <w:ilvl w:val="1"/>
+          <w:numId w:val="12"/>
+        </w:numPr>
+      </w:pPr>
+      <w:r>
+        <w:t>List section:</w:t>
+      </w:r>
+    </w:p>
+    <w:p>
+      <w:pPr>
+        <w:pStyle w:val="ListParagraph"/>
+        <w:numPr>
+          <w:ilvl w:val="2"/>
+          <w:numId w:val="12"/>
+        </w:numPr>
+      </w:pPr>
+      <w:r>
+        <w:t xml:space="preserve">Button for </w:t>
+      </w:r>
+      <w:r>
+        <w:t>creating</w:t>
+      </w:r>
+      <w:r>
+        <w:t xml:space="preserve"> list</w:t>
+      </w:r>
+      <w:r>
+        <w:t xml:space="preserve"> item</w:t>
+      </w:r>
+    </w:p>
+    <w:p>
+      <w:pPr>
+        <w:pStyle w:val="ListParagraph"/>
+        <w:numPr>
+          <w:ilvl w:val="2"/>
+          <w:numId w:val="12"/>
+        </w:numPr>
+      </w:pPr>
+      <w:r>
+        <w:t>Button for editing item</w:t>
+      </w:r>
+      <w:r>
+        <w:t xml:space="preserve"> (name, date, priority, notifications etc)</w:t>
+      </w:r>
+    </w:p>
+    <w:p>
+      <w:pPr>
+        <w:pStyle w:val="ListParagraph"/>
+        <w:numPr>
+          <w:ilvl w:val="2"/>
+          <w:numId w:val="12"/>
+        </w:numPr>
+      </w:pPr>
+      <w:r>
+        <w:t>Button for deleting item (could be in edit popup)</w:t>
+      </w:r>
+    </w:p>
+    <w:p>
+      <w:pPr>
+        <w:pStyle w:val="ListParagraph"/>
+        <w:numPr>
+          <w:ilvl w:val="2"/>
+          <w:numId w:val="12"/>
+        </w:numPr>
+      </w:pPr>
+      <w:r>
+        <w:t>Button for completing</w:t>
+      </w:r>
+      <w:r>
+        <w:t xml:space="preserve"> list</w:t>
+      </w:r>
+      <w:r>
+        <w:t xml:space="preserve"> item</w:t>
+      </w:r>
+    </w:p>
+    <w:p>
+      <w:pPr>
+        <w:pStyle w:val="ListParagraph"/>
+        <w:numPr>
+          <w:ilvl w:val="2"/>
+          <w:numId w:val="12"/>
+        </w:numPr>
+      </w:pPr>
+      <w:r>
+        <w:t>Button for viewing subtasks</w:t>
+      </w:r>
+    </w:p>
+    <w:p>
+      <w:pPr>
+        <w:pStyle w:val="ListParagraph"/>
+        <w:numPr>
+          <w:ilvl w:val="1"/>
+          <w:numId w:val="12"/>
+        </w:numPr>
+      </w:pPr>
+      <w:r>
+        <w:t>Completed tasks</w:t>
+      </w:r>
+      <w:r>
+        <w:t xml:space="preserve"> section:</w:t>
+      </w:r>
+    </w:p>
+    <w:p>
+      <w:pPr>
+        <w:pStyle w:val="ListParagraph"/>
+        <w:numPr>
+          <w:ilvl w:val="2"/>
+          <w:numId w:val="12"/>
+        </w:numPr>
+      </w:pPr>
+      <w:r>
+        <w:t>Button for marking as uncomplete</w:t>
+      </w:r>
+    </w:p>
+    <w:p>
+      <w:pPr>
+        <w:pStyle w:val="ListParagraph"/>
+        <w:numPr>
+          <w:ilvl w:val="2"/>
+          <w:numId w:val="12"/>
+        </w:numPr>
+      </w:pPr>
+      <w:r>
+        <w:t>Button for deleting</w:t>
+      </w:r>
+    </w:p>
+    <w:p>
+      <w:r>
+        <w:t>Design:</w:t>
+      </w:r>
+    </w:p>
+    <w:p/>
     <w:p>
       <w:pPr>
         <w:pStyle w:val="Heading1"/>
       </w:pPr>
-      <w:r>
-        <w:t>Technical Research</w:t>
-      </w:r>
-    </w:p>
+      <w:bookmarkStart w:id="15" w:name="_Toc208332757"/>
+      <w:r>
+        <w:t>Implementation</w:t>
+      </w:r>
+      <w:bookmarkEnd w:id="15"/>
+    </w:p>
+    <w:p/>
     <w:p>
       <w:pPr>
         <w:pStyle w:val="Heading1"/>
       </w:pPr>
-      <w:r>
-        <w:t>Design Inspiration</w:t>
-      </w:r>
-    </w:p>
+      <w:bookmarkStart w:id="16" w:name="_Toc208332758"/>
+      <w:r>
+        <w:t>Testing</w:t>
+      </w:r>
+      <w:bookmarkEnd w:id="16"/>
+    </w:p>
+    <w:p/>
     <w:p>
       <w:pPr>
         <w:pStyle w:val="Heading1"/>
       </w:pPr>
-      <w:r>
-        <w:t>Next Steps</w:t>
-      </w:r>
+      <w:bookmarkStart w:id="17" w:name="_Toc208332759"/>
+      <w:r>
+        <w:t>Conclusion</w:t>
+      </w:r>
+      <w:bookmarkEnd w:id="17"/>
     </w:p>
     <w:sectPr>
       <w:pgSz w:w="11906" w:h="16838"/>
@@ -264,6 +2385,119 @@
 <file path=word/numbering.xml><?xml version="1.0" encoding="utf-8"?>
 <w:numbering xmlns:wpc="http://schemas.microsoft.com/office/word/2010/wordprocessingCanvas" xmlns:cx="http://schemas.microsoft.com/office/drawing/2014/chartex" xmlns:cx1="http://schemas.microsoft.com/office/drawing/2015/9/8/chartex" xmlns:cx2="http://schemas.microsoft.com/office/drawing/2015/10/21/chartex" xmlns:cx3="http://schemas.microsoft.com/office/drawing/2016/5/9/chartex" xmlns:cx4="http://schemas.microsoft.com/office/drawing/2016/5/10/chartex" xmlns:cx5="http://schemas.microsoft.com/office/drawing/2016/5/11/chartex" xmlns:cx6="http://schemas.microsoft.com/office/drawing/2016/5/12/chartex" xmlns:cx7="http://schemas.microsoft.com/office/drawing/2016/5/13/chartex" xmlns:cx8="http://schemas.microsoft.com/office/drawing/2016/5/14/chartex" xmlns:mc="http://schemas.openxmlformats.org/markup-compatibility/2006" xmlns:aink="http://schemas.microsoft.com/office/drawing/2016/ink" xmlns:am3d="http://schemas.microsoft.com/office/drawing/2017/model3d" xmlns:o="urn:schemas-microsoft-com:office:office" xmlns:oel="http://schemas.microsoft.com/office/2019/extlst" xmlns:r="http://schemas.openxmlformats.org/officeDocument/2006/relationships" xmlns:m="http://schemas.openxmlformats.org/officeDocument/2006/math" xmlns:v="urn:schemas-microsoft-com:vml" xmlns:wp14="http://schemas.microsoft.com/office/word/2010/wordprocessingDrawing" xmlns:wp="http://schemas.openxmlformats.org/drawingml/2006/wordprocessingDrawing" xmlns:w10="urn:schemas-microsoft-com:office:word" xmlns:w="http://schemas.openxmlformats.org/wordprocessingml/2006/main" xmlns:w14="http://schemas.microsoft.com/office/word/2010/wordml" xmlns:w15="http://schemas.microsoft.com/office/word/2012/wordml" xmlns:w16cex="http://schemas.microsoft.com/office/word/2018/wordml/cex" xmlns:w16cid="http://schemas.microsoft.com/office/word/2016/wordml/cid" xmlns:w16="http://schemas.microsoft.com/office/word/2018/wordml" xmlns:w16du="http://schemas.microsoft.com/office/word/2023/wordml/word16du" xmlns:w16sdtdh="http://schemas.microsoft.com/office/word/2020/wordml/sdtdatahash" xmlns:w16sdtfl="http://schemas.microsoft.com/office/word/2024/wordml/sdtformatlock" xmlns:w16se="http://schemas.microsoft.com/office/word/2015/wordml/symex" xmlns:wpg="http://schemas.microsoft.com/office/word/2010/wordprocessingGroup" xmlns:wpi="http://schemas.microsoft.com/office/word/2010/wordprocessingInk" xmlns:wne="http://schemas.microsoft.com/office/word/2006/wordml" xmlns:wps="http://schemas.microsoft.com/office/word/2010/wordprocessingShape" mc:Ignorable="w14 w15 w16se w16cid w16 w16cex w16sdtdh w16sdtfl w16du wp14">
   <w:abstractNum w:abstractNumId="0" w15:restartNumberingAfterBreak="0">
+    <w:nsid w:val="0C1817A3"/>
+    <w:multiLevelType w:val="hybridMultilevel"/>
+    <w:tmpl w:val="03F066F4"/>
+    <w:lvl w:ilvl="0" w:tplc="08090001">
+      <w:start w:val="1"/>
+      <w:numFmt w:val="bullet"/>
+      <w:lvlText w:val=""/>
+      <w:lvlJc w:val="left"/>
+      <w:pPr>
+        <w:ind w:left="720" w:hanging="360"/>
+      </w:pPr>
+      <w:rPr>
+        <w:rFonts w:ascii="Symbol" w:hAnsi="Symbol" w:hint="default"/>
+      </w:rPr>
+    </w:lvl>
+    <w:lvl w:ilvl="1" w:tplc="08090003" w:tentative="1">
+      <w:start w:val="1"/>
+      <w:numFmt w:val="bullet"/>
+      <w:lvlText w:val="o"/>
+      <w:lvlJc w:val="left"/>
+      <w:pPr>
+        <w:ind w:left="1440" w:hanging="360"/>
+      </w:pPr>
+      <w:rPr>
+        <w:rFonts w:ascii="Courier New" w:hAnsi="Courier New" w:cs="Courier New" w:hint="default"/>
+      </w:rPr>
+    </w:lvl>
+    <w:lvl w:ilvl="2" w:tplc="08090005" w:tentative="1">
+      <w:start w:val="1"/>
+      <w:numFmt w:val="bullet"/>
+      <w:lvlText w:val=""/>
+      <w:lvlJc w:val="left"/>
+      <w:pPr>
+        <w:ind w:left="2160" w:hanging="360"/>
+      </w:pPr>
+      <w:rPr>
+        <w:rFonts w:ascii="Wingdings" w:hAnsi="Wingdings" w:hint="default"/>
+      </w:rPr>
+    </w:lvl>
+    <w:lvl w:ilvl="3" w:tplc="08090001" w:tentative="1">
+      <w:start w:val="1"/>
+      <w:numFmt w:val="bullet"/>
+      <w:lvlText w:val=""/>
+      <w:lvlJc w:val="left"/>
+      <w:pPr>
+        <w:ind w:left="2880" w:hanging="360"/>
+      </w:pPr>
+      <w:rPr>
+        <w:rFonts w:ascii="Symbol" w:hAnsi="Symbol" w:hint="default"/>
+      </w:rPr>
+    </w:lvl>
+    <w:lvl w:ilvl="4" w:tplc="08090003" w:tentative="1">
+      <w:start w:val="1"/>
+      <w:numFmt w:val="bullet"/>
+      <w:lvlText w:val="o"/>
+      <w:lvlJc w:val="left"/>
+      <w:pPr>
+        <w:ind w:left="3600" w:hanging="360"/>
+      </w:pPr>
+      <w:rPr>
+        <w:rFonts w:ascii="Courier New" w:hAnsi="Courier New" w:cs="Courier New" w:hint="default"/>
+      </w:rPr>
+    </w:lvl>
+    <w:lvl w:ilvl="5" w:tplc="08090005" w:tentative="1">
+      <w:start w:val="1"/>
+      <w:numFmt w:val="bullet"/>
+      <w:lvlText w:val=""/>
+      <w:lvlJc w:val="left"/>
+      <w:pPr>
+        <w:ind w:left="4320" w:hanging="360"/>
+      </w:pPr>
+      <w:rPr>
+        <w:rFonts w:ascii="Wingdings" w:hAnsi="Wingdings" w:hint="default"/>
+      </w:rPr>
+    </w:lvl>
+    <w:lvl w:ilvl="6" w:tplc="08090001" w:tentative="1">
+      <w:start w:val="1"/>
+      <w:numFmt w:val="bullet"/>
+      <w:lvlText w:val=""/>
+      <w:lvlJc w:val="left"/>
+      <w:pPr>
+        <w:ind w:left="5040" w:hanging="360"/>
+      </w:pPr>
+      <w:rPr>
+        <w:rFonts w:ascii="Symbol" w:hAnsi="Symbol" w:hint="default"/>
+      </w:rPr>
+    </w:lvl>
+    <w:lvl w:ilvl="7" w:tplc="08090003" w:tentative="1">
+      <w:start w:val="1"/>
+      <w:numFmt w:val="bullet"/>
+      <w:lvlText w:val="o"/>
+      <w:lvlJc w:val="left"/>
+      <w:pPr>
+        <w:ind w:left="5760" w:hanging="360"/>
+      </w:pPr>
+      <w:rPr>
+        <w:rFonts w:ascii="Courier New" w:hAnsi="Courier New" w:cs="Courier New" w:hint="default"/>
+      </w:rPr>
+    </w:lvl>
+    <w:lvl w:ilvl="8" w:tplc="08090005" w:tentative="1">
+      <w:start w:val="1"/>
+      <w:numFmt w:val="bullet"/>
+      <w:lvlText w:val=""/>
+      <w:lvlJc w:val="left"/>
+      <w:pPr>
+        <w:ind w:left="6480" w:hanging="360"/>
+      </w:pPr>
+      <w:rPr>
+        <w:rFonts w:ascii="Wingdings" w:hAnsi="Wingdings" w:hint="default"/>
+      </w:rPr>
+    </w:lvl>
+  </w:abstractNum>
+  <w:abstractNum w:abstractNumId="1" w15:restartNumberingAfterBreak="0">
     <w:nsid w:val="1C145064"/>
     <w:multiLevelType w:val="hybridMultilevel"/>
     <w:tmpl w:val="9DC2C42A"/>
@@ -376,7 +2610,7 @@
       </w:rPr>
     </w:lvl>
   </w:abstractNum>
-  <w:abstractNum w:abstractNumId="1" w15:restartNumberingAfterBreak="0">
+  <w:abstractNum w:abstractNumId="2" w15:restartNumberingAfterBreak="0">
     <w:nsid w:val="1F6E76F7"/>
     <w:multiLevelType w:val="multilevel"/>
     <w:tmpl w:val="58C02546"/>
@@ -525,7 +2759,7 @@
       </w:rPr>
     </w:lvl>
   </w:abstractNum>
-  <w:abstractNum w:abstractNumId="2" w15:restartNumberingAfterBreak="0">
+  <w:abstractNum w:abstractNumId="3" w15:restartNumberingAfterBreak="0">
     <w:nsid w:val="2B081D0B"/>
     <w:multiLevelType w:val="multilevel"/>
     <w:tmpl w:val="AB56955E"/>
@@ -674,7 +2908,7 @@
       </w:rPr>
     </w:lvl>
   </w:abstractNum>
-  <w:abstractNum w:abstractNumId="3" w15:restartNumberingAfterBreak="0">
+  <w:abstractNum w:abstractNumId="4" w15:restartNumberingAfterBreak="0">
     <w:nsid w:val="376D0670"/>
     <w:multiLevelType w:val="multilevel"/>
     <w:tmpl w:val="45D2E302"/>
@@ -823,7 +3057,120 @@
       </w:rPr>
     </w:lvl>
   </w:abstractNum>
-  <w:abstractNum w:abstractNumId="4" w15:restartNumberingAfterBreak="0">
+  <w:abstractNum w:abstractNumId="5" w15:restartNumberingAfterBreak="0">
+    <w:nsid w:val="41145D18"/>
+    <w:multiLevelType w:val="hybridMultilevel"/>
+    <w:tmpl w:val="B554EABA"/>
+    <w:lvl w:ilvl="0" w:tplc="08090001">
+      <w:start w:val="1"/>
+      <w:numFmt w:val="bullet"/>
+      <w:lvlText w:val=""/>
+      <w:lvlJc w:val="left"/>
+      <w:pPr>
+        <w:ind w:left="720" w:hanging="360"/>
+      </w:pPr>
+      <w:rPr>
+        <w:rFonts w:ascii="Symbol" w:hAnsi="Symbol" w:hint="default"/>
+      </w:rPr>
+    </w:lvl>
+    <w:lvl w:ilvl="1" w:tplc="08090003">
+      <w:start w:val="1"/>
+      <w:numFmt w:val="bullet"/>
+      <w:lvlText w:val="o"/>
+      <w:lvlJc w:val="left"/>
+      <w:pPr>
+        <w:ind w:left="1440" w:hanging="360"/>
+      </w:pPr>
+      <w:rPr>
+        <w:rFonts w:ascii="Courier New" w:hAnsi="Courier New" w:cs="Courier New" w:hint="default"/>
+      </w:rPr>
+    </w:lvl>
+    <w:lvl w:ilvl="2" w:tplc="08090005">
+      <w:start w:val="1"/>
+      <w:numFmt w:val="bullet"/>
+      <w:lvlText w:val=""/>
+      <w:lvlJc w:val="left"/>
+      <w:pPr>
+        <w:ind w:left="2160" w:hanging="360"/>
+      </w:pPr>
+      <w:rPr>
+        <w:rFonts w:ascii="Wingdings" w:hAnsi="Wingdings" w:hint="default"/>
+      </w:rPr>
+    </w:lvl>
+    <w:lvl w:ilvl="3" w:tplc="08090001" w:tentative="1">
+      <w:start w:val="1"/>
+      <w:numFmt w:val="bullet"/>
+      <w:lvlText w:val=""/>
+      <w:lvlJc w:val="left"/>
+      <w:pPr>
+        <w:ind w:left="2880" w:hanging="360"/>
+      </w:pPr>
+      <w:rPr>
+        <w:rFonts w:ascii="Symbol" w:hAnsi="Symbol" w:hint="default"/>
+      </w:rPr>
+    </w:lvl>
+    <w:lvl w:ilvl="4" w:tplc="08090003" w:tentative="1">
+      <w:start w:val="1"/>
+      <w:numFmt w:val="bullet"/>
+      <w:lvlText w:val="o"/>
+      <w:lvlJc w:val="left"/>
+      <w:pPr>
+        <w:ind w:left="3600" w:hanging="360"/>
+      </w:pPr>
+      <w:rPr>
+        <w:rFonts w:ascii="Courier New" w:hAnsi="Courier New" w:cs="Courier New" w:hint="default"/>
+      </w:rPr>
+    </w:lvl>
+    <w:lvl w:ilvl="5" w:tplc="08090005" w:tentative="1">
+      <w:start w:val="1"/>
+      <w:numFmt w:val="bullet"/>
+      <w:lvlText w:val=""/>
+      <w:lvlJc w:val="left"/>
+      <w:pPr>
+        <w:ind w:left="4320" w:hanging="360"/>
+      </w:pPr>
+      <w:rPr>
+        <w:rFonts w:ascii="Wingdings" w:hAnsi="Wingdings" w:hint="default"/>
+      </w:rPr>
+    </w:lvl>
+    <w:lvl w:ilvl="6" w:tplc="08090001" w:tentative="1">
+      <w:start w:val="1"/>
+      <w:numFmt w:val="bullet"/>
+      <w:lvlText w:val=""/>
+      <w:lvlJc w:val="left"/>
+      <w:pPr>
+        <w:ind w:left="5040" w:hanging="360"/>
+      </w:pPr>
+      <w:rPr>
+        <w:rFonts w:ascii="Symbol" w:hAnsi="Symbol" w:hint="default"/>
+      </w:rPr>
+    </w:lvl>
+    <w:lvl w:ilvl="7" w:tplc="08090003" w:tentative="1">
+      <w:start w:val="1"/>
+      <w:numFmt w:val="bullet"/>
+      <w:lvlText w:val="o"/>
+      <w:lvlJc w:val="left"/>
+      <w:pPr>
+        <w:ind w:left="5760" w:hanging="360"/>
+      </w:pPr>
+      <w:rPr>
+        <w:rFonts w:ascii="Courier New" w:hAnsi="Courier New" w:cs="Courier New" w:hint="default"/>
+      </w:rPr>
+    </w:lvl>
+    <w:lvl w:ilvl="8" w:tplc="08090005" w:tentative="1">
+      <w:start w:val="1"/>
+      <w:numFmt w:val="bullet"/>
+      <w:lvlText w:val=""/>
+      <w:lvlJc w:val="left"/>
+      <w:pPr>
+        <w:ind w:left="6480" w:hanging="360"/>
+      </w:pPr>
+      <w:rPr>
+        <w:rFonts w:ascii="Wingdings" w:hAnsi="Wingdings" w:hint="default"/>
+      </w:rPr>
+    </w:lvl>
+  </w:abstractNum>
+  <w:abstractNum w:abstractNumId="6" w15:restartNumberingAfterBreak="0">
     <w:nsid w:val="45FA5133"/>
     <w:multiLevelType w:val="multilevel"/>
     <w:tmpl w:val="A5AC3764"/>
@@ -972,7 +3319,7 @@
       </w:rPr>
     </w:lvl>
   </w:abstractNum>
-  <w:abstractNum w:abstractNumId="5" w15:restartNumberingAfterBreak="0">
+  <w:abstractNum w:abstractNumId="7" w15:restartNumberingAfterBreak="0">
     <w:nsid w:val="5FCD088C"/>
     <w:multiLevelType w:val="multilevel"/>
     <w:tmpl w:val="12C20296"/>
@@ -1121,7 +3468,120 @@
       </w:rPr>
     </w:lvl>
   </w:abstractNum>
-  <w:abstractNum w:abstractNumId="6" w15:restartNumberingAfterBreak="0">
+  <w:abstractNum w:abstractNumId="8" w15:restartNumberingAfterBreak="0">
+    <w:nsid w:val="696471DE"/>
+    <w:multiLevelType w:val="hybridMultilevel"/>
+    <w:tmpl w:val="5BF6522E"/>
+    <w:lvl w:ilvl="0" w:tplc="08090001">
+      <w:start w:val="1"/>
+      <w:numFmt w:val="bullet"/>
+      <w:lvlText w:val=""/>
+      <w:lvlJc w:val="left"/>
+      <w:pPr>
+        <w:ind w:left="720" w:hanging="360"/>
+      </w:pPr>
+      <w:rPr>
+        <w:rFonts w:ascii="Symbol" w:hAnsi="Symbol" w:hint="default"/>
+      </w:rPr>
+    </w:lvl>
+    <w:lvl w:ilvl="1" w:tplc="08090003" w:tentative="1">
+      <w:start w:val="1"/>
+      <w:numFmt w:val="bullet"/>
+      <w:lvlText w:val="o"/>
+      <w:lvlJc w:val="left"/>
+      <w:pPr>
+        <w:ind w:left="1440" w:hanging="360"/>
+      </w:pPr>
+      <w:rPr>
+        <w:rFonts w:ascii="Courier New" w:hAnsi="Courier New" w:cs="Courier New" w:hint="default"/>
+      </w:rPr>
+    </w:lvl>
+    <w:lvl w:ilvl="2" w:tplc="08090005" w:tentative="1">
+      <w:start w:val="1"/>
+      <w:numFmt w:val="bullet"/>
+      <w:lvlText w:val=""/>
+      <w:lvlJc w:val="left"/>
+      <w:pPr>
+        <w:ind w:left="2160" w:hanging="360"/>
+      </w:pPr>
+      <w:rPr>
+        <w:rFonts w:ascii="Wingdings" w:hAnsi="Wingdings" w:hint="default"/>
+      </w:rPr>
+    </w:lvl>
+    <w:lvl w:ilvl="3" w:tplc="08090001" w:tentative="1">
+      <w:start w:val="1"/>
+      <w:numFmt w:val="bullet"/>
+      <w:lvlText w:val=""/>
+      <w:lvlJc w:val="left"/>
+      <w:pPr>
+        <w:ind w:left="2880" w:hanging="360"/>
+      </w:pPr>
+      <w:rPr>
+        <w:rFonts w:ascii="Symbol" w:hAnsi="Symbol" w:hint="default"/>
+      </w:rPr>
+    </w:lvl>
+    <w:lvl w:ilvl="4" w:tplc="08090003" w:tentative="1">
+      <w:start w:val="1"/>
+      <w:numFmt w:val="bullet"/>
+      <w:lvlText w:val="o"/>
+      <w:lvlJc w:val="left"/>
+      <w:pPr>
+        <w:ind w:left="3600" w:hanging="360"/>
+      </w:pPr>
+      <w:rPr>
+        <w:rFonts w:ascii="Courier New" w:hAnsi="Courier New" w:cs="Courier New" w:hint="default"/>
+      </w:rPr>
+    </w:lvl>
+    <w:lvl w:ilvl="5" w:tplc="08090005" w:tentative="1">
+      <w:start w:val="1"/>
+      <w:numFmt w:val="bullet"/>
+      <w:lvlText w:val=""/>
+      <w:lvlJc w:val="left"/>
+      <w:pPr>
+        <w:ind w:left="4320" w:hanging="360"/>
+      </w:pPr>
+      <w:rPr>
+        <w:rFonts w:ascii="Wingdings" w:hAnsi="Wingdings" w:hint="default"/>
+      </w:rPr>
+    </w:lvl>
+    <w:lvl w:ilvl="6" w:tplc="08090001" w:tentative="1">
+      <w:start w:val="1"/>
+      <w:numFmt w:val="bullet"/>
+      <w:lvlText w:val=""/>
+      <w:lvlJc w:val="left"/>
+      <w:pPr>
+        <w:ind w:left="5040" w:hanging="360"/>
+      </w:pPr>
+      <w:rPr>
+        <w:rFonts w:ascii="Symbol" w:hAnsi="Symbol" w:hint="default"/>
+      </w:rPr>
+    </w:lvl>
+    <w:lvl w:ilvl="7" w:tplc="08090003" w:tentative="1">
+      <w:start w:val="1"/>
+      <w:numFmt w:val="bullet"/>
+      <w:lvlText w:val="o"/>
+      <w:lvlJc w:val="left"/>
+      <w:pPr>
+        <w:ind w:left="5760" w:hanging="360"/>
+      </w:pPr>
+      <w:rPr>
+        <w:rFonts w:ascii="Courier New" w:hAnsi="Courier New" w:cs="Courier New" w:hint="default"/>
+      </w:rPr>
+    </w:lvl>
+    <w:lvl w:ilvl="8" w:tplc="08090005" w:tentative="1">
+      <w:start w:val="1"/>
+      <w:numFmt w:val="bullet"/>
+      <w:lvlText w:val=""/>
+      <w:lvlJc w:val="left"/>
+      <w:pPr>
+        <w:ind w:left="6480" w:hanging="360"/>
+      </w:pPr>
+      <w:rPr>
+        <w:rFonts w:ascii="Wingdings" w:hAnsi="Wingdings" w:hint="default"/>
+      </w:rPr>
+    </w:lvl>
+  </w:abstractNum>
+  <w:abstractNum w:abstractNumId="9" w15:restartNumberingAfterBreak="0">
     <w:nsid w:val="6BAE4FE1"/>
     <w:multiLevelType w:val="multilevel"/>
     <w:tmpl w:val="5AE0B92E"/>
@@ -1270,7 +3730,96 @@
       </w:rPr>
     </w:lvl>
   </w:abstractNum>
-  <w:abstractNum w:abstractNumId="7" w15:restartNumberingAfterBreak="0">
+  <w:abstractNum w:abstractNumId="10" w15:restartNumberingAfterBreak="0">
+    <w:nsid w:val="6FE6295A"/>
+    <w:multiLevelType w:val="hybridMultilevel"/>
+    <w:tmpl w:val="EC66BFE4"/>
+    <w:lvl w:ilvl="0" w:tplc="08090011">
+      <w:start w:val="1"/>
+      <w:numFmt w:val="decimal"/>
+      <w:lvlText w:val="%1)"/>
+      <w:lvlJc w:val="left"/>
+      <w:pPr>
+        <w:ind w:left="720" w:hanging="360"/>
+      </w:pPr>
+      <w:rPr>
+        <w:rFonts w:hint="default"/>
+      </w:rPr>
+    </w:lvl>
+    <w:lvl w:ilvl="1" w:tplc="08090019" w:tentative="1">
+      <w:start w:val="1"/>
+      <w:numFmt w:val="lowerLetter"/>
+      <w:lvlText w:val="%2."/>
+      <w:lvlJc w:val="left"/>
+      <w:pPr>
+        <w:ind w:left="1440" w:hanging="360"/>
+      </w:pPr>
+    </w:lvl>
+    <w:lvl w:ilvl="2" w:tplc="0809001B" w:tentative="1">
+      <w:start w:val="1"/>
+      <w:numFmt w:val="lowerRoman"/>
+      <w:lvlText w:val="%3."/>
+      <w:lvlJc w:val="right"/>
+      <w:pPr>
+        <w:ind w:left="2160" w:hanging="180"/>
+      </w:pPr>
+    </w:lvl>
+    <w:lvl w:ilvl="3" w:tplc="0809000F" w:tentative="1">
+      <w:start w:val="1"/>
+      <w:numFmt w:val="decimal"/>
+      <w:lvlText w:val="%4."/>
+      <w:lvlJc w:val="left"/>
+      <w:pPr>
+        <w:ind w:left="2880" w:hanging="360"/>
+      </w:pPr>
+    </w:lvl>
+    <w:lvl w:ilvl="4" w:tplc="08090019" w:tentative="1">
+      <w:start w:val="1"/>
+      <w:numFmt w:val="lowerLetter"/>
+      <w:lvlText w:val="%5."/>
+      <w:lvlJc w:val="left"/>
+      <w:pPr>
+        <w:ind w:left="3600" w:hanging="360"/>
+      </w:pPr>
+    </w:lvl>
+    <w:lvl w:ilvl="5" w:tplc="0809001B" w:tentative="1">
+      <w:start w:val="1"/>
+      <w:numFmt w:val="lowerRoman"/>
+      <w:lvlText w:val="%6."/>
+      <w:lvlJc w:val="right"/>
+      <w:pPr>
+        <w:ind w:left="4320" w:hanging="180"/>
+      </w:pPr>
+    </w:lvl>
+    <w:lvl w:ilvl="6" w:tplc="0809000F" w:tentative="1">
+      <w:start w:val="1"/>
+      <w:numFmt w:val="decimal"/>
+      <w:lvlText w:val="%7."/>
+      <w:lvlJc w:val="left"/>
+      <w:pPr>
+        <w:ind w:left="5040" w:hanging="360"/>
+      </w:pPr>
+    </w:lvl>
+    <w:lvl w:ilvl="7" w:tplc="08090019" w:tentative="1">
+      <w:start w:val="1"/>
+      <w:numFmt w:val="lowerLetter"/>
+      <w:lvlText w:val="%8."/>
+      <w:lvlJc w:val="left"/>
+      <w:pPr>
+        <w:ind w:left="5760" w:hanging="360"/>
+      </w:pPr>
+    </w:lvl>
+    <w:lvl w:ilvl="8" w:tplc="0809001B" w:tentative="1">
+      <w:start w:val="1"/>
+      <w:numFmt w:val="lowerRoman"/>
+      <w:lvlText w:val="%9."/>
+      <w:lvlJc w:val="right"/>
+      <w:pPr>
+        <w:ind w:left="6480" w:hanging="180"/>
+      </w:pPr>
+    </w:lvl>
+  </w:abstractNum>
+  <w:abstractNum w:abstractNumId="11" w15:restartNumberingAfterBreak="0">
     <w:nsid w:val="7A1019C4"/>
     <w:multiLevelType w:val="multilevel"/>
     <w:tmpl w:val="56929CF6"/>
@@ -1420,28 +3969,40 @@
     </w:lvl>
   </w:abstractNum>
   <w:num w:numId="1" w16cid:durableId="266162841">
+    <w:abstractNumId w:val="11"/>
+  </w:num>
+  <w:num w:numId="2" w16cid:durableId="1523665995">
+    <w:abstractNumId w:val="9"/>
+  </w:num>
+  <w:num w:numId="3" w16cid:durableId="1517577931">
+    <w:abstractNumId w:val="3"/>
+  </w:num>
+  <w:num w:numId="4" w16cid:durableId="1059599318">
+    <w:abstractNumId w:val="6"/>
+  </w:num>
+  <w:num w:numId="5" w16cid:durableId="1383602087">
     <w:abstractNumId w:val="7"/>
   </w:num>
-  <w:num w:numId="2" w16cid:durableId="1523665995">
-    <w:abstractNumId w:val="6"/>
-  </w:num>
-  <w:num w:numId="3" w16cid:durableId="1517577931">
+  <w:num w:numId="6" w16cid:durableId="852912643">
     <w:abstractNumId w:val="2"/>
   </w:num>
-  <w:num w:numId="4" w16cid:durableId="1059599318">
+  <w:num w:numId="7" w16cid:durableId="888565937">
     <w:abstractNumId w:val="4"/>
   </w:num>
-  <w:num w:numId="5" w16cid:durableId="1383602087">
-    <w:abstractNumId w:val="5"/>
-  </w:num>
-  <w:num w:numId="6" w16cid:durableId="852912643">
+  <w:num w:numId="8" w16cid:durableId="604505642">
     <w:abstractNumId w:val="1"/>
   </w:num>
-  <w:num w:numId="7" w16cid:durableId="888565937">
-    <w:abstractNumId w:val="3"/>
+  <w:num w:numId="9" w16cid:durableId="1176847243">
+    <w:abstractNumId w:val="10"/>
   </w:num>
-  <w:num w:numId="8" w16cid:durableId="604505642">
+  <w:num w:numId="10" w16cid:durableId="370376508">
+    <w:abstractNumId w:val="8"/>
+  </w:num>
+  <w:num w:numId="11" w16cid:durableId="880744839">
     <w:abstractNumId w:val="0"/>
+  </w:num>
+  <w:num w:numId="12" w16cid:durableId="1939673096">
+    <w:abstractNumId w:val="5"/>
   </w:num>
 </w:numbering>
 </file>
@@ -1846,6 +4407,7 @@
   <w:style w:type="paragraph" w:default="1" w:styleId="Normal">
     <w:name w:val="Normal"/>
     <w:qFormat/>
+    <w:rsid w:val="005459DE"/>
   </w:style>
   <w:style w:type="paragraph" w:styleId="Heading1">
     <w:name w:val="heading 1"/>
@@ -1876,7 +4438,7 @@
     <w:uiPriority w:val="9"/>
     <w:unhideWhenUsed/>
     <w:qFormat/>
-    <w:rsid w:val="002E431A"/>
+    <w:rsid w:val="006D5BD8"/>
     <w:pPr>
       <w:keepNext/>
       <w:keepLines/>
@@ -1896,7 +4458,6 @@
     <w:next w:val="Normal"/>
     <w:link w:val="Heading3Char"/>
     <w:uiPriority w:val="9"/>
-    <w:semiHidden/>
     <w:unhideWhenUsed/>
     <w:qFormat/>
     <w:rsid w:val="002E431A"/>
@@ -2048,6 +4609,7 @@
   <w:style w:type="character" w:default="1" w:styleId="DefaultParagraphFont">
     <w:name w:val="Default Paragraph Font"/>
     <w:uiPriority w:val="1"/>
+    <w:semiHidden/>
     <w:unhideWhenUsed/>
   </w:style>
   <w:style w:type="table" w:default="1" w:styleId="TableNormal">
@@ -2089,7 +4651,7 @@
     <w:basedOn w:val="DefaultParagraphFont"/>
     <w:link w:val="Heading2"/>
     <w:uiPriority w:val="9"/>
-    <w:rsid w:val="002E431A"/>
+    <w:rsid w:val="006D5BD8"/>
     <w:rPr>
       <w:rFonts w:asciiTheme="majorHAnsi" w:eastAsiaTheme="majorEastAsia" w:hAnsiTheme="majorHAnsi" w:cstheme="majorBidi"/>
       <w:color w:val="0F4761" w:themeColor="accent1" w:themeShade="BF"/>
@@ -2102,7 +4664,6 @@
     <w:basedOn w:val="DefaultParagraphFont"/>
     <w:link w:val="Heading3"/>
     <w:uiPriority w:val="9"/>
-    <w:semiHidden/>
     <w:rsid w:val="002E431A"/>
     <w:rPr>
       <w:rFonts w:eastAsiaTheme="majorEastAsia" w:cstheme="majorBidi"/>
@@ -2359,6 +4920,75 @@
       <w:color w:val="0F4761" w:themeColor="accent1" w:themeShade="BF"/>
       <w:spacing w:val="5"/>
     </w:rPr>
+  </w:style>
+  <w:style w:type="paragraph" w:styleId="TOCHeading">
+    <w:name w:val="TOC Heading"/>
+    <w:basedOn w:val="Heading1"/>
+    <w:next w:val="Normal"/>
+    <w:uiPriority w:val="39"/>
+    <w:unhideWhenUsed/>
+    <w:qFormat/>
+    <w:rsid w:val="005516D3"/>
+    <w:pPr>
+      <w:spacing w:before="240" w:after="0" w:line="259" w:lineRule="auto"/>
+      <w:outlineLvl w:val="9"/>
+    </w:pPr>
+    <w:rPr>
+      <w:kern w:val="0"/>
+      <w:sz w:val="32"/>
+      <w:szCs w:val="32"/>
+      <w:lang w:val="en-US"/>
+      <w14:ligatures w14:val="none"/>
+    </w:rPr>
+  </w:style>
+  <w:style w:type="paragraph" w:styleId="TOC1">
+    <w:name w:val="toc 1"/>
+    <w:basedOn w:val="Normal"/>
+    <w:next w:val="Normal"/>
+    <w:autoRedefine/>
+    <w:uiPriority w:val="39"/>
+    <w:unhideWhenUsed/>
+    <w:rsid w:val="005516D3"/>
+    <w:pPr>
+      <w:spacing w:after="100"/>
+    </w:pPr>
+  </w:style>
+  <w:style w:type="paragraph" w:styleId="TOC2">
+    <w:name w:val="toc 2"/>
+    <w:basedOn w:val="Normal"/>
+    <w:next w:val="Normal"/>
+    <w:autoRedefine/>
+    <w:uiPriority w:val="39"/>
+    <w:unhideWhenUsed/>
+    <w:rsid w:val="005516D3"/>
+    <w:pPr>
+      <w:spacing w:after="100"/>
+      <w:ind w:left="240"/>
+    </w:pPr>
+  </w:style>
+  <w:style w:type="character" w:styleId="Hyperlink">
+    <w:name w:val="Hyperlink"/>
+    <w:basedOn w:val="DefaultParagraphFont"/>
+    <w:uiPriority w:val="99"/>
+    <w:unhideWhenUsed/>
+    <w:rsid w:val="005516D3"/>
+    <w:rPr>
+      <w:color w:val="467886" w:themeColor="hyperlink"/>
+      <w:u w:val="single"/>
+    </w:rPr>
+  </w:style>
+  <w:style w:type="paragraph" w:styleId="TOC3">
+    <w:name w:val="toc 3"/>
+    <w:basedOn w:val="Normal"/>
+    <w:next w:val="Normal"/>
+    <w:autoRedefine/>
+    <w:uiPriority w:val="39"/>
+    <w:unhideWhenUsed/>
+    <w:rsid w:val="0009340A"/>
+    <w:pPr>
+      <w:spacing w:after="100"/>
+      <w:ind w:left="480"/>
+    </w:pPr>
   </w:style>
 </w:styles>
 </file>
@@ -2676,4 +5306,16 @@
     </a:ext>
   </a:extLst>
 </a:theme>
+</file>
+
+<file path=customXml/item1.xml><?xml version="1.0" encoding="utf-8"?>
+<b:Sources xmlns:b="http://schemas.openxmlformats.org/officeDocument/2006/bibliography" xmlns="http://schemas.openxmlformats.org/officeDocument/2006/bibliography" SelectedStyle="\APASixthEditionOfficeOnline.xsl" StyleName="APA" Version="6"/>
+</file>
+
+<file path=customXml/itemProps1.xml><?xml version="1.0" encoding="utf-8"?>
+<ds:datastoreItem xmlns:ds="http://schemas.openxmlformats.org/officeDocument/2006/customXml" ds:itemID="{7F31B60F-B432-420A-A24E-CCECE17C5A2C}">
+  <ds:schemaRefs>
+    <ds:schemaRef ds:uri="http://schemas.openxmlformats.org/officeDocument/2006/bibliography"/>
+  </ds:schemaRefs>
+</ds:datastoreItem>
 </file>
</xml_diff>